<commit_message>
docs(cadrage v4): graphiques matplotlib + export Excel KPIs
- build_charts.py : 4 PNG (decomposition 2x2, per_scenario_xl,
  lead_time_comparison, additivity) - donnees XL et Random
- build_cadrage_v4_docx.py : detection markdown image et insertion via
  doc.add_picture()
- cadrage_v4.md : insertion des 4 graphiques aux sections appropriees
  (24.3, 24.6.4, 24.6.5)
- build_excel_kpis.py : 3 feuilles (XL 4000 runs, Random 1600 runs,
  decomposition 2x2 + additivite)
- cadrage_v4.docx regenere avec les graphiques embarques
</commit_message>
<xml_diff>
--- a/docs/cadrage_v4.docx
+++ b/docs/cadrage_v4.docx
@@ -3442,6 +3442,108 @@
         </w:tc>
       </w:tr>
     </w:tbl>
+    <w:p>
+      <w:pPr>
+        <w:jc w:val="center"/>
+      </w:pPr>
+      <w:r>
+        <w:drawing>
+          <wp:inline xmlns:a="http://schemas.openxmlformats.org/drawingml/2006/main" xmlns:pic="http://schemas.openxmlformats.org/drawingml/2006/picture">
+            <wp:extent cx="5669280" cy="2389955"/>
+            <wp:docPr id="1" name="Picture 1"/>
+            <wp:cNvGraphicFramePr>
+              <a:graphicFrameLocks noChangeAspect="1"/>
+            </wp:cNvGraphicFramePr>
+            <a:graphic>
+              <a:graphicData uri="http://schemas.openxmlformats.org/drawingml/2006/picture">
+                <pic:pic>
+                  <pic:nvPicPr>
+                    <pic:cNvPr id="0" name="decomposition_2x2.png"/>
+                    <pic:cNvPicPr/>
+                  </pic:nvPicPr>
+                  <pic:blipFill>
+                    <a:blip r:embed="rId9"/>
+                    <a:stretch>
+                      <a:fillRect/>
+                    </a:stretch>
+                  </pic:blipFill>
+                  <pic:spPr>
+                    <a:xfrm>
+                      <a:off x="0" y="0"/>
+                      <a:ext cx="5669280" cy="2389955"/>
+                    </a:xfrm>
+                    <a:prstGeom prst="rect"/>
+                  </pic:spPr>
+                </pic:pic>
+              </a:graphicData>
+            </a:graphic>
+          </wp:inline>
+        </w:drawing>
+      </w:r>
+    </w:p>
+    <w:p>
+      <w:pPr>
+        <w:jc w:val="center"/>
+      </w:pPr>
+      <w:r>
+        <w:rPr>
+          <w:i/>
+          <w:sz w:val="18"/>
+        </w:rPr>
+        <w:t>Décomposition 2×2 — Δ coût vs OF sur les 2 protocoles</w:t>
+      </w:r>
+    </w:p>
+    <w:p>
+      <w:pPr>
+        <w:jc w:val="center"/>
+      </w:pPr>
+      <w:r>
+        <w:drawing>
+          <wp:inline xmlns:a="http://schemas.openxmlformats.org/drawingml/2006/main" xmlns:pic="http://schemas.openxmlformats.org/drawingml/2006/picture">
+            <wp:extent cx="5669280" cy="2576613"/>
+            <wp:docPr id="2" name="Picture 2"/>
+            <wp:cNvGraphicFramePr>
+              <a:graphicFrameLocks noChangeAspect="1"/>
+            </wp:cNvGraphicFramePr>
+            <a:graphic>
+              <a:graphicData uri="http://schemas.openxmlformats.org/drawingml/2006/picture">
+                <pic:pic>
+                  <pic:nvPicPr>
+                    <pic:cNvPr id="0" name="per_scenario_xl.png"/>
+                    <pic:cNvPicPr/>
+                  </pic:nvPicPr>
+                  <pic:blipFill>
+                    <a:blip r:embed="rId10"/>
+                    <a:stretch>
+                      <a:fillRect/>
+                    </a:stretch>
+                  </pic:blipFill>
+                  <pic:spPr>
+                    <a:xfrm>
+                      <a:off x="0" y="0"/>
+                      <a:ext cx="5669280" cy="2576613"/>
+                    </a:xfrm>
+                    <a:prstGeom prst="rect"/>
+                  </pic:spPr>
+                </pic:pic>
+              </a:graphicData>
+            </a:graphic>
+          </wp:inline>
+        </w:drawing>
+      </w:r>
+    </w:p>
+    <w:p>
+      <w:pPr>
+        <w:jc w:val="center"/>
+      </w:pPr>
+      <w:r>
+        <w:rPr>
+          <w:i/>
+          <w:sz w:val="18"/>
+        </w:rPr>
+        <w:t>Δ coût par scénario × doctrine — 4 000 runs XL</w:t>
+      </w:r>
+    </w:p>
     <w:p>
       <w:pPr>
         <w:pStyle w:val="Heading3"/>
@@ -4844,6 +4946,57 @@
       </w:r>
     </w:p>
     <w:p>
+      <w:pPr>
+        <w:jc w:val="center"/>
+      </w:pPr>
+      <w:r>
+        <w:drawing>
+          <wp:inline xmlns:a="http://schemas.openxmlformats.org/drawingml/2006/main" xmlns:pic="http://schemas.openxmlformats.org/drawingml/2006/picture">
+            <wp:extent cx="5669280" cy="3528349"/>
+            <wp:docPr id="3" name="Picture 3"/>
+            <wp:cNvGraphicFramePr>
+              <a:graphicFrameLocks noChangeAspect="1"/>
+            </wp:cNvGraphicFramePr>
+            <a:graphic>
+              <a:graphicData uri="http://schemas.openxmlformats.org/drawingml/2006/picture">
+                <pic:pic>
+                  <pic:nvPicPr>
+                    <pic:cNvPr id="0" name="additivity.png"/>
+                    <pic:cNvPicPr/>
+                  </pic:nvPicPr>
+                  <pic:blipFill>
+                    <a:blip r:embed="rId11"/>
+                    <a:stretch>
+                      <a:fillRect/>
+                    </a:stretch>
+                  </pic:blipFill>
+                  <pic:spPr>
+                    <a:xfrm>
+                      <a:off x="0" y="0"/>
+                      <a:ext cx="5669280" cy="3528349"/>
+                    </a:xfrm>
+                    <a:prstGeom prst="rect"/>
+                  </pic:spPr>
+                </pic:pic>
+              </a:graphicData>
+            </a:graphic>
+          </wp:inline>
+        </w:drawing>
+      </w:r>
+    </w:p>
+    <w:p>
+      <w:pPr>
+        <w:jc w:val="center"/>
+      </w:pPr>
+      <w:r>
+        <w:rPr>
+          <w:i/>
+          <w:sz w:val="18"/>
+        </w:rPr>
+        <w:t>Additivité quasi-parfaite — flux seul + event seul ≈ combiné</w:t>
+      </w:r>
+    </w:p>
+    <w:p>
       <w:r>
         <w:t>Découverte 2 — Magnitude amplifiée par la diversité</w:t>
       </w:r>
@@ -5247,6 +5400,57 @@
     <w:p>
       <w:r>
         <w:t>est un argument scientifique fort en faveur de la doctrine.</w:t>
+      </w:r>
+    </w:p>
+    <w:p>
+      <w:pPr>
+        <w:jc w:val="center"/>
+      </w:pPr>
+      <w:r>
+        <w:drawing>
+          <wp:inline xmlns:a="http://schemas.openxmlformats.org/drawingml/2006/main" xmlns:pic="http://schemas.openxmlformats.org/drawingml/2006/picture">
+            <wp:extent cx="5669280" cy="3092335"/>
+            <wp:docPr id="4" name="Picture 4"/>
+            <wp:cNvGraphicFramePr>
+              <a:graphicFrameLocks noChangeAspect="1"/>
+            </wp:cNvGraphicFramePr>
+            <a:graphic>
+              <a:graphicData uri="http://schemas.openxmlformats.org/drawingml/2006/picture">
+                <pic:pic>
+                  <pic:nvPicPr>
+                    <pic:cNvPr id="0" name="lead_time_comparison.png"/>
+                    <pic:cNvPicPr/>
+                  </pic:nvPicPr>
+                  <pic:blipFill>
+                    <a:blip r:embed="rId12"/>
+                    <a:stretch>
+                      <a:fillRect/>
+                    </a:stretch>
+                  </pic:blipFill>
+                  <pic:spPr>
+                    <a:xfrm>
+                      <a:off x="0" y="0"/>
+                      <a:ext cx="5669280" cy="3092335"/>
+                    </a:xfrm>
+                    <a:prstGeom prst="rect"/>
+                  </pic:spPr>
+                </pic:pic>
+              </a:graphicData>
+            </a:graphic>
+          </wp:inline>
+        </w:drawing>
+      </w:r>
+    </w:p>
+    <w:p>
+      <w:pPr>
+        <w:jc w:val="center"/>
+      </w:pPr>
+      <w:r>
+        <w:rPr>
+          <w:i/>
+          <w:sz w:val="18"/>
+        </w:rPr>
+        <w:t>Lead time par doctrine — convergence des 2 protocoles</w:t>
       </w:r>
     </w:p>
     <w:p>

</xml_diff>

<commit_message>
docs(cadrage v4): §24.8 resilience integrale (856 runs)
- §24.8.1 distributions (P50/P75/P95/P99, ratios queue lourde)
- §24.8.2 gradient d'intensite (courbe plate documentee honnetement)
- §24.8.3 cascade 1-5 pannes (sensibilite 5x plus faible pour EVENT)
- §24.8.4 verdict + 5 limites explicites (in-silico, pas IEC 60050)
- DOCX regenere avec 3 PNG resilience embarques
- XLSX enrichi d'une feuille Resilience_856_runs (P95/P99, gradient,
  cascade, MTTR, sensibilite)

Resultats : EVENT a la meilleure queue (P95 220k vs 261k OF),
5x moins sensible a la cascade (+4.5% vs +23.2%), MTTR 1.6-2x
plus court. Gradient d'intensite plat -> protocole revisable.
</commit_message>
<xml_diff>
--- a/docs/cadrage_v4.docx
+++ b/docs/cadrage_v4.docx
@@ -5602,6 +5602,2575 @@
       </w:pPr>
       <w:r>
         <w:t>garde-fou anti-surengagement</w:t>
+      </w:r>
+    </w:p>
+    <w:p/>
+    <w:p>
+      <w:pPr>
+        <w:pStyle w:val="Heading2"/>
+      </w:pPr>
+      <w:r>
+        <w:t>§24.8 Analyse de résilience (placeholder — sera rempli par l'étude résilience)</w:t>
+      </w:r>
+    </w:p>
+    <w:p>
+      <w:r>
+        <w:t>Cette section comble cinq manques identifiés pour parler de **résilience</w:t>
+      </w:r>
+    </w:p>
+    <w:p>
+      <w:r>
+        <w:t>au sens technique** et non plus seulement de supériorité moyenne :</w:t>
+      </w:r>
+    </w:p>
+    <w:p>
+      <w:r>
+        <w:t>1. Distributions de coût : statistiques d'ordre P50/P75/P95/P99</w:t>
+      </w:r>
+    </w:p>
+    <w:p>
+      <w:r>
+        <w:t xml:space="preserve">   au lieu de moyenne ± écart-type seul.</w:t>
+      </w:r>
+    </w:p>
+    <w:p>
+      <w:r>
+        <w:t>2. Time-to-recover (proxy MTTR) : nombre de jours entre le pic de</w:t>
+      </w:r>
+    </w:p>
+    <w:p>
+      <w:r>
+        <w:t xml:space="preserve">   WIP post-choc et le retour sous médiane × 1.30.</w:t>
+      </w:r>
+    </w:p>
+    <w:p>
+      <w:r>
+        <w:t>3. Gradient d'intensité : performance en fonction d'un facteur</w:t>
+      </w:r>
+    </w:p>
+    <w:p>
+      <w:r>
+        <w:t xml:space="preserve">   d'amplification des aléas (×0.5 à ×2.5).</w:t>
+      </w:r>
+    </w:p>
+    <w:p>
+      <w:r>
+        <w:t>4. Cascade de défaillances : 1 à 5 pannes simultanées au même</w:t>
+      </w:r>
+    </w:p>
+    <w:p>
+      <w:r>
+        <w:t xml:space="preserve">   jour sur des postes différents.</w:t>
+      </w:r>
+    </w:p>
+    <w:p>
+      <w:r>
+        <w:t>5. Tail risk : visualisation P95/P99 sur boîtes à moustaches.</w:t>
+      </w:r>
+    </w:p>
+    <w:p>
+      <w:r>
+        <w:t>L'étude est produite par python docs/build_resilience_analysis.py</w:t>
+      </w:r>
+    </w:p>
+    <w:p>
+      <w:r>
+        <w:t>(module pilotage_flux.comparative.resilience). Les chiffres sont</w:t>
+      </w:r>
+    </w:p>
+    <w:p>
+      <w:r>
+        <w:t>écrits dans docs/cadrage_v4_resilience_data.md et insérés ci-dessous</w:t>
+      </w:r>
+    </w:p>
+    <w:p>
+      <w:r>
+        <w:t>après chaque exécution.</w:t>
+      </w:r>
+    </w:p>
+    <w:p>
+      <w:pPr>
+        <w:pStyle w:val="Heading3"/>
+      </w:pPr>
+      <w:r>
+        <w:t>§24.8.1 Distributions de coût (statistiques d'ordre)</w:t>
+      </w:r>
+    </w:p>
+    <w:p>
+      <w:r>
+        <w:t>Étude sur 256 runs (8 fixtures × 8 scénarios × 4 doctrines) avec</w:t>
+      </w:r>
+    </w:p>
+    <w:p>
+      <w:r>
+        <w:t>distributions brutes conservées :</w:t>
+      </w:r>
+    </w:p>
+    <w:tbl>
+      <w:tblPr>
+        <w:tblStyle w:val="LightGrid-Accent1"/>
+        <w:tblW w:type="auto" w:w="0"/>
+        <w:tblLook w:firstColumn="1" w:firstRow="1" w:lastColumn="0" w:lastRow="0" w:noHBand="0" w:noVBand="1" w:val="04A0"/>
+      </w:tblPr>
+      <w:tblGrid>
+        <w:gridCol w:w="960"/>
+        <w:gridCol w:w="960"/>
+        <w:gridCol w:w="960"/>
+        <w:gridCol w:w="960"/>
+        <w:gridCol w:w="960"/>
+        <w:gridCol w:w="960"/>
+        <w:gridCol w:w="960"/>
+        <w:gridCol w:w="960"/>
+        <w:gridCol w:w="960"/>
+      </w:tblGrid>
+      <w:tr>
+        <w:tc>
+          <w:tcPr>
+            <w:tcW w:type="dxa" w:w="960"/>
+          </w:tcPr>
+          <w:p>
+            <w:r>
+              <w:rPr>
+                <w:b/>
+              </w:rPr>
+              <w:t>Doctrine</w:t>
+            </w:r>
+          </w:p>
+        </w:tc>
+        <w:tc>
+          <w:tcPr>
+            <w:tcW w:type="dxa" w:w="960"/>
+          </w:tcPr>
+          <w:p>
+            <w:r>
+              <w:rPr>
+                <w:b/>
+              </w:rPr>
+              <w:t>N</w:t>
+            </w:r>
+          </w:p>
+        </w:tc>
+        <w:tc>
+          <w:tcPr>
+            <w:tcW w:type="dxa" w:w="960"/>
+          </w:tcPr>
+          <w:p>
+            <w:r>
+              <w:rPr>
+                <w:b/>
+              </w:rPr>
+              <w:t>Moyenne</w:t>
+            </w:r>
+          </w:p>
+        </w:tc>
+        <w:tc>
+          <w:tcPr>
+            <w:tcW w:type="dxa" w:w="960"/>
+          </w:tcPr>
+          <w:p>
+            <w:r>
+              <w:rPr>
+                <w:b/>
+              </w:rPr>
+              <w:t>σ</w:t>
+            </w:r>
+          </w:p>
+        </w:tc>
+        <w:tc>
+          <w:tcPr>
+            <w:tcW w:type="dxa" w:w="960"/>
+          </w:tcPr>
+          <w:p>
+            <w:r>
+              <w:rPr>
+                <w:b/>
+              </w:rPr>
+              <w:t>P50</w:t>
+            </w:r>
+          </w:p>
+        </w:tc>
+        <w:tc>
+          <w:tcPr>
+            <w:tcW w:type="dxa" w:w="960"/>
+          </w:tcPr>
+          <w:p>
+            <w:r>
+              <w:rPr>
+                <w:b/>
+              </w:rPr>
+              <w:t>P75</w:t>
+            </w:r>
+          </w:p>
+        </w:tc>
+        <w:tc>
+          <w:tcPr>
+            <w:tcW w:type="dxa" w:w="960"/>
+          </w:tcPr>
+          <w:p>
+            <w:r>
+              <w:rPr>
+                <w:b/>
+              </w:rPr>
+              <w:t>P95</w:t>
+            </w:r>
+          </w:p>
+        </w:tc>
+        <w:tc>
+          <w:tcPr>
+            <w:tcW w:type="dxa" w:w="960"/>
+          </w:tcPr>
+          <w:p>
+            <w:r>
+              <w:rPr>
+                <w:b/>
+              </w:rPr>
+              <w:t>P99</w:t>
+            </w:r>
+          </w:p>
+        </w:tc>
+        <w:tc>
+          <w:tcPr>
+            <w:tcW w:type="dxa" w:w="960"/>
+          </w:tcPr>
+          <w:p>
+            <w:r>
+              <w:rPr>
+                <w:b/>
+              </w:rPr>
+              <w:t>Max</w:t>
+            </w:r>
+          </w:p>
+        </w:tc>
+      </w:tr>
+      <w:tr>
+        <w:tc>
+          <w:tcPr>
+            <w:tcW w:type="dxa" w:w="960"/>
+          </w:tcPr>
+          <w:p>
+            <w:r>
+              <w:t>OF</w:t>
+            </w:r>
+          </w:p>
+        </w:tc>
+        <w:tc>
+          <w:tcPr>
+            <w:tcW w:type="dxa" w:w="960"/>
+          </w:tcPr>
+          <w:p>
+            <w:r>
+              <w:t>64</w:t>
+            </w:r>
+          </w:p>
+        </w:tc>
+        <w:tc>
+          <w:tcPr>
+            <w:tcW w:type="dxa" w:w="960"/>
+          </w:tcPr>
+          <w:p>
+            <w:r>
+              <w:t>152 028 €</w:t>
+            </w:r>
+          </w:p>
+        </w:tc>
+        <w:tc>
+          <w:tcPr>
+            <w:tcW w:type="dxa" w:w="960"/>
+          </w:tcPr>
+          <w:p>
+            <w:r>
+              <w:t>55 230 €</w:t>
+            </w:r>
+          </w:p>
+        </w:tc>
+        <w:tc>
+          <w:tcPr>
+            <w:tcW w:type="dxa" w:w="960"/>
+          </w:tcPr>
+          <w:p>
+            <w:r>
+              <w:t>136 213</w:t>
+            </w:r>
+          </w:p>
+        </w:tc>
+        <w:tc>
+          <w:tcPr>
+            <w:tcW w:type="dxa" w:w="960"/>
+          </w:tcPr>
+          <w:p>
+            <w:r>
+              <w:t>174 280</w:t>
+            </w:r>
+          </w:p>
+        </w:tc>
+        <w:tc>
+          <w:tcPr>
+            <w:tcW w:type="dxa" w:w="960"/>
+          </w:tcPr>
+          <w:p>
+            <w:r>
+              <w:t>**261 855**</w:t>
+            </w:r>
+          </w:p>
+        </w:tc>
+        <w:tc>
+          <w:tcPr>
+            <w:tcW w:type="dxa" w:w="960"/>
+          </w:tcPr>
+          <w:p>
+            <w:r>
+              <w:t>**316 851**</w:t>
+            </w:r>
+          </w:p>
+        </w:tc>
+        <w:tc>
+          <w:tcPr>
+            <w:tcW w:type="dxa" w:w="960"/>
+          </w:tcPr>
+          <w:p>
+            <w:r>
+              <w:t>359 912</w:t>
+            </w:r>
+          </w:p>
+        </w:tc>
+      </w:tr>
+      <w:tr>
+        <w:tc>
+          <w:tcPr>
+            <w:tcW w:type="dxa" w:w="960"/>
+          </w:tcPr>
+          <w:p>
+            <w:r>
+              <w:t>FLUX</w:t>
+            </w:r>
+          </w:p>
+        </w:tc>
+        <w:tc>
+          <w:tcPr>
+            <w:tcW w:type="dxa" w:w="960"/>
+          </w:tcPr>
+          <w:p>
+            <w:r>
+              <w:t>64</w:t>
+            </w:r>
+          </w:p>
+        </w:tc>
+        <w:tc>
+          <w:tcPr>
+            <w:tcW w:type="dxa" w:w="960"/>
+          </w:tcPr>
+          <w:p>
+            <w:r>
+              <w:t>126 940 €</w:t>
+            </w:r>
+          </w:p>
+        </w:tc>
+        <w:tc>
+          <w:tcPr>
+            <w:tcW w:type="dxa" w:w="960"/>
+          </w:tcPr>
+          <w:p>
+            <w:r>
+              <w:t>49 975 €</w:t>
+            </w:r>
+          </w:p>
+        </w:tc>
+        <w:tc>
+          <w:tcPr>
+            <w:tcW w:type="dxa" w:w="960"/>
+          </w:tcPr>
+          <w:p>
+            <w:r>
+              <w:t>119 951</w:t>
+            </w:r>
+          </w:p>
+        </w:tc>
+        <w:tc>
+          <w:tcPr>
+            <w:tcW w:type="dxa" w:w="960"/>
+          </w:tcPr>
+          <w:p>
+            <w:r>
+              <w:t>147 237</w:t>
+            </w:r>
+          </w:p>
+        </w:tc>
+        <w:tc>
+          <w:tcPr>
+            <w:tcW w:type="dxa" w:w="960"/>
+          </w:tcPr>
+          <w:p>
+            <w:r>
+              <w:t>**222 570**</w:t>
+            </w:r>
+          </w:p>
+        </w:tc>
+        <w:tc>
+          <w:tcPr>
+            <w:tcW w:type="dxa" w:w="960"/>
+          </w:tcPr>
+          <w:p>
+            <w:r>
+              <w:t>**289 395**</w:t>
+            </w:r>
+          </w:p>
+        </w:tc>
+        <w:tc>
+          <w:tcPr>
+            <w:tcW w:type="dxa" w:w="960"/>
+          </w:tcPr>
+          <w:p>
+            <w:r>
+              <w:t>321 560</w:t>
+            </w:r>
+          </w:p>
+        </w:tc>
+      </w:tr>
+      <w:tr>
+        <w:tc>
+          <w:tcPr>
+            <w:tcW w:type="dxa" w:w="960"/>
+          </w:tcPr>
+          <w:p>
+            <w:r>
+              <w:t>OF+EVENT</w:t>
+            </w:r>
+          </w:p>
+        </w:tc>
+        <w:tc>
+          <w:tcPr>
+            <w:tcW w:type="dxa" w:w="960"/>
+          </w:tcPr>
+          <w:p>
+            <w:r>
+              <w:t>64</w:t>
+            </w:r>
+          </w:p>
+        </w:tc>
+        <w:tc>
+          <w:tcPr>
+            <w:tcW w:type="dxa" w:w="960"/>
+          </w:tcPr>
+          <w:p>
+            <w:r>
+              <w:t>146 672 €</w:t>
+            </w:r>
+          </w:p>
+        </w:tc>
+        <w:tc>
+          <w:tcPr>
+            <w:tcW w:type="dxa" w:w="960"/>
+          </w:tcPr>
+          <w:p>
+            <w:r>
+              <w:t>56 155 €</w:t>
+            </w:r>
+          </w:p>
+        </w:tc>
+        <w:tc>
+          <w:tcPr>
+            <w:tcW w:type="dxa" w:w="960"/>
+          </w:tcPr>
+          <w:p>
+            <w:r>
+              <w:t>135 383</w:t>
+            </w:r>
+          </w:p>
+        </w:tc>
+        <w:tc>
+          <w:tcPr>
+            <w:tcW w:type="dxa" w:w="960"/>
+          </w:tcPr>
+          <w:p>
+            <w:r>
+              <w:t>167 709</w:t>
+            </w:r>
+          </w:p>
+        </w:tc>
+        <w:tc>
+          <w:tcPr>
+            <w:tcW w:type="dxa" w:w="960"/>
+          </w:tcPr>
+          <w:p>
+            <w:r>
+              <w:t>**276 428**</w:t>
+            </w:r>
+          </w:p>
+        </w:tc>
+        <w:tc>
+          <w:tcPr>
+            <w:tcW w:type="dxa" w:w="960"/>
+          </w:tcPr>
+          <w:p>
+            <w:r>
+              <w:t>**310 432**</w:t>
+            </w:r>
+          </w:p>
+        </w:tc>
+        <w:tc>
+          <w:tcPr>
+            <w:tcW w:type="dxa" w:w="960"/>
+          </w:tcPr>
+          <w:p>
+            <w:r>
+              <w:t>342 564</w:t>
+            </w:r>
+          </w:p>
+        </w:tc>
+      </w:tr>
+      <w:tr>
+        <w:tc>
+          <w:tcPr>
+            <w:tcW w:type="dxa" w:w="960"/>
+          </w:tcPr>
+          <w:p>
+            <w:r>
+              <w:t>EVENT</w:t>
+            </w:r>
+          </w:p>
+        </w:tc>
+        <w:tc>
+          <w:tcPr>
+            <w:tcW w:type="dxa" w:w="960"/>
+          </w:tcPr>
+          <w:p>
+            <w:r>
+              <w:t>64</w:t>
+            </w:r>
+          </w:p>
+        </w:tc>
+        <w:tc>
+          <w:tcPr>
+            <w:tcW w:type="dxa" w:w="960"/>
+          </w:tcPr>
+          <w:p>
+            <w:r>
+              <w:t>121 866 €</w:t>
+            </w:r>
+          </w:p>
+        </w:tc>
+        <w:tc>
+          <w:tcPr>
+            <w:tcW w:type="dxa" w:w="960"/>
+          </w:tcPr>
+          <w:p>
+            <w:r>
+              <w:t>50 233 €</w:t>
+            </w:r>
+          </w:p>
+        </w:tc>
+        <w:tc>
+          <w:tcPr>
+            <w:tcW w:type="dxa" w:w="960"/>
+          </w:tcPr>
+          <w:p>
+            <w:r>
+              <w:t>112 829</w:t>
+            </w:r>
+          </w:p>
+        </w:tc>
+        <w:tc>
+          <w:tcPr>
+            <w:tcW w:type="dxa" w:w="960"/>
+          </w:tcPr>
+          <w:p>
+            <w:r>
+              <w:t>141 320</w:t>
+            </w:r>
+          </w:p>
+        </w:tc>
+        <w:tc>
+          <w:tcPr>
+            <w:tcW w:type="dxa" w:w="960"/>
+          </w:tcPr>
+          <w:p>
+            <w:r>
+              <w:t>**220 793**</w:t>
+            </w:r>
+          </w:p>
+        </w:tc>
+        <w:tc>
+          <w:tcPr>
+            <w:tcW w:type="dxa" w:w="960"/>
+          </w:tcPr>
+          <w:p>
+            <w:r>
+              <w:t>**286 827**</w:t>
+            </w:r>
+          </w:p>
+        </w:tc>
+        <w:tc>
+          <w:tcPr>
+            <w:tcW w:type="dxa" w:w="960"/>
+          </w:tcPr>
+          <w:p>
+            <w:r>
+              <w:t>314 621</w:t>
+            </w:r>
+          </w:p>
+        </w:tc>
+      </w:tr>
+    </w:tbl>
+    <w:p>
+      <w:r>
+        <w:t>Ratios P95/P50 et P99/P50 — indicateurs de queue lourde :</w:t>
+      </w:r>
+    </w:p>
+    <w:tbl>
+      <w:tblPr>
+        <w:tblStyle w:val="LightGrid-Accent1"/>
+        <w:tblW w:type="auto" w:w="0"/>
+        <w:tblLook w:firstColumn="1" w:firstRow="1" w:lastColumn="0" w:lastRow="0" w:noHBand="0" w:noVBand="1" w:val="04A0"/>
+      </w:tblPr>
+      <w:tblGrid>
+        <w:gridCol w:w="2880"/>
+        <w:gridCol w:w="2880"/>
+        <w:gridCol w:w="2880"/>
+      </w:tblGrid>
+      <w:tr>
+        <w:tc>
+          <w:tcPr>
+            <w:tcW w:type="dxa" w:w="2880"/>
+          </w:tcPr>
+          <w:p>
+            <w:r>
+              <w:rPr>
+                <w:b/>
+              </w:rPr>
+              <w:t>Doctrine</w:t>
+            </w:r>
+          </w:p>
+        </w:tc>
+        <w:tc>
+          <w:tcPr>
+            <w:tcW w:type="dxa" w:w="2880"/>
+          </w:tcPr>
+          <w:p>
+            <w:r>
+              <w:rPr>
+                <w:b/>
+              </w:rPr>
+              <w:t>P95/P50</w:t>
+            </w:r>
+          </w:p>
+        </w:tc>
+        <w:tc>
+          <w:tcPr>
+            <w:tcW w:type="dxa" w:w="2880"/>
+          </w:tcPr>
+          <w:p>
+            <w:r>
+              <w:rPr>
+                <w:b/>
+              </w:rPr>
+              <w:t>P99/P50</w:t>
+            </w:r>
+          </w:p>
+        </w:tc>
+      </w:tr>
+      <w:tr>
+        <w:tc>
+          <w:tcPr>
+            <w:tcW w:type="dxa" w:w="2880"/>
+          </w:tcPr>
+          <w:p>
+            <w:r>
+              <w:t>OF</w:t>
+            </w:r>
+          </w:p>
+        </w:tc>
+        <w:tc>
+          <w:tcPr>
+            <w:tcW w:type="dxa" w:w="2880"/>
+          </w:tcPr>
+          <w:p>
+            <w:r>
+              <w:t>1.92</w:t>
+            </w:r>
+          </w:p>
+        </w:tc>
+        <w:tc>
+          <w:tcPr>
+            <w:tcW w:type="dxa" w:w="2880"/>
+          </w:tcPr>
+          <w:p>
+            <w:r>
+              <w:t>2.33</w:t>
+            </w:r>
+          </w:p>
+        </w:tc>
+      </w:tr>
+      <w:tr>
+        <w:tc>
+          <w:tcPr>
+            <w:tcW w:type="dxa" w:w="2880"/>
+          </w:tcPr>
+          <w:p>
+            <w:r>
+              <w:t>FLUX</w:t>
+            </w:r>
+          </w:p>
+        </w:tc>
+        <w:tc>
+          <w:tcPr>
+            <w:tcW w:type="dxa" w:w="2880"/>
+          </w:tcPr>
+          <w:p>
+            <w:r>
+              <w:t>1.86</w:t>
+            </w:r>
+          </w:p>
+        </w:tc>
+        <w:tc>
+          <w:tcPr>
+            <w:tcW w:type="dxa" w:w="2880"/>
+          </w:tcPr>
+          <w:p>
+            <w:r>
+              <w:t>2.41</w:t>
+            </w:r>
+          </w:p>
+        </w:tc>
+      </w:tr>
+      <w:tr>
+        <w:tc>
+          <w:tcPr>
+            <w:tcW w:type="dxa" w:w="2880"/>
+          </w:tcPr>
+          <w:p>
+            <w:r>
+              <w:t>OF+EVENT</w:t>
+            </w:r>
+          </w:p>
+        </w:tc>
+        <w:tc>
+          <w:tcPr>
+            <w:tcW w:type="dxa" w:w="2880"/>
+          </w:tcPr>
+          <w:p>
+            <w:r>
+              <w:t>2.04</w:t>
+            </w:r>
+          </w:p>
+        </w:tc>
+        <w:tc>
+          <w:tcPr>
+            <w:tcW w:type="dxa" w:w="2880"/>
+          </w:tcPr>
+          <w:p>
+            <w:r>
+              <w:t>2.29</w:t>
+            </w:r>
+          </w:p>
+        </w:tc>
+      </w:tr>
+      <w:tr>
+        <w:tc>
+          <w:tcPr>
+            <w:tcW w:type="dxa" w:w="2880"/>
+          </w:tcPr>
+          <w:p>
+            <w:r>
+              <w:t>**EVENT**</w:t>
+            </w:r>
+          </w:p>
+        </w:tc>
+        <w:tc>
+          <w:tcPr>
+            <w:tcW w:type="dxa" w:w="2880"/>
+          </w:tcPr>
+          <w:p>
+            <w:r>
+              <w:t>**1.96**</w:t>
+            </w:r>
+          </w:p>
+        </w:tc>
+        <w:tc>
+          <w:tcPr>
+            <w:tcW w:type="dxa" w:w="2880"/>
+          </w:tcPr>
+          <w:p>
+            <w:r>
+              <w:t>**2.54**</w:t>
+            </w:r>
+          </w:p>
+        </w:tc>
+      </w:tr>
+    </w:tbl>
+    <w:p>
+      <w:pPr>
+        <w:jc w:val="center"/>
+      </w:pPr>
+      <w:r>
+        <w:drawing>
+          <wp:inline xmlns:a="http://schemas.openxmlformats.org/drawingml/2006/main" xmlns:pic="http://schemas.openxmlformats.org/drawingml/2006/picture">
+            <wp:extent cx="5669280" cy="3386220"/>
+            <wp:docPr id="5" name="Picture 5"/>
+            <wp:cNvGraphicFramePr>
+              <a:graphicFrameLocks noChangeAspect="1"/>
+            </wp:cNvGraphicFramePr>
+            <a:graphic>
+              <a:graphicData uri="http://schemas.openxmlformats.org/drawingml/2006/picture">
+                <pic:pic>
+                  <pic:nvPicPr>
+                    <pic:cNvPr id="0" name="resilience_distribution.png"/>
+                    <pic:cNvPicPr/>
+                  </pic:nvPicPr>
+                  <pic:blipFill>
+                    <a:blip r:embed="rId13"/>
+                    <a:stretch>
+                      <a:fillRect/>
+                    </a:stretch>
+                  </pic:blipFill>
+                  <pic:spPr>
+                    <a:xfrm>
+                      <a:off x="0" y="0"/>
+                      <a:ext cx="5669280" cy="3386220"/>
+                    </a:xfrm>
+                    <a:prstGeom prst="rect"/>
+                  </pic:spPr>
+                </pic:pic>
+              </a:graphicData>
+            </a:graphic>
+          </wp:inline>
+        </w:drawing>
+      </w:r>
+    </w:p>
+    <w:p>
+      <w:pPr>
+        <w:jc w:val="center"/>
+      </w:pPr>
+      <w:r>
+        <w:rPr>
+          <w:i/>
+          <w:sz w:val="18"/>
+        </w:rPr>
+        <w:t>Distribution du coût par doctrine — boîtes à moustaches</w:t>
+      </w:r>
+    </w:p>
+    <w:p>
+      <w:r>
+        <w:t>Lecture résilience : P95 et P99 mesurent le « pire raisonnable »</w:t>
+      </w:r>
+    </w:p>
+    <w:p>
+      <w:r>
+        <w:t>et le « pire extrême ». Une doctrine résiliente présente une P95</w:t>
+      </w:r>
+    </w:p>
+    <w:p>
+      <w:r>
+        <w:t>proche de sa médiane (queue de distribution courte). Les ratios</w:t>
+      </w:r>
+    </w:p>
+    <w:p>
+      <w:r>
+        <w:t>P99/P50 et P95/P50 par doctrine quantifient ce risque de queue.</w:t>
+      </w:r>
+    </w:p>
+    <w:p>
+      <w:pPr>
+        <w:pStyle w:val="Heading3"/>
+      </w:pPr>
+      <w:r>
+        <w:t>§24.8.2 Gradient d'intensité d'aléa</w:t>
+      </w:r>
+    </w:p>
+    <w:p>
+      <w:r>
+        <w:t>Étude sur 300 runs (5 intensités × 15 seeds × 4 doctrines) sur</w:t>
+      </w:r>
+    </w:p>
+    <w:p>
+      <w:r>
+        <w:t>fixture industrielle fixe (seed 42).</w:t>
+      </w:r>
+    </w:p>
+    <w:tbl>
+      <w:tblPr>
+        <w:tblStyle w:val="LightGrid-Accent1"/>
+        <w:tblW w:type="auto" w:w="0"/>
+        <w:tblLook w:firstColumn="1" w:firstRow="1" w:lastColumn="0" w:lastRow="0" w:noHBand="0" w:noVBand="1" w:val="04A0"/>
+      </w:tblPr>
+      <w:tblGrid>
+        <w:gridCol w:w="1728"/>
+        <w:gridCol w:w="1728"/>
+        <w:gridCol w:w="1728"/>
+        <w:gridCol w:w="1728"/>
+        <w:gridCol w:w="1728"/>
+      </w:tblGrid>
+      <w:tr>
+        <w:tc>
+          <w:tcPr>
+            <w:tcW w:type="dxa" w:w="1728"/>
+          </w:tcPr>
+          <w:p>
+            <w:r>
+              <w:rPr>
+                <w:b/>
+              </w:rPr>
+              <w:t>Intensité</w:t>
+            </w:r>
+          </w:p>
+        </w:tc>
+        <w:tc>
+          <w:tcPr>
+            <w:tcW w:type="dxa" w:w="1728"/>
+          </w:tcPr>
+          <w:p>
+            <w:r>
+              <w:rPr>
+                <w:b/>
+              </w:rPr>
+              <w:t>OF</w:t>
+            </w:r>
+          </w:p>
+        </w:tc>
+        <w:tc>
+          <w:tcPr>
+            <w:tcW w:type="dxa" w:w="1728"/>
+          </w:tcPr>
+          <w:p>
+            <w:r>
+              <w:rPr>
+                <w:b/>
+              </w:rPr>
+              <w:t>FLUX</w:t>
+            </w:r>
+          </w:p>
+        </w:tc>
+        <w:tc>
+          <w:tcPr>
+            <w:tcW w:type="dxa" w:w="1728"/>
+          </w:tcPr>
+          <w:p>
+            <w:r>
+              <w:rPr>
+                <w:b/>
+              </w:rPr>
+              <w:t>OF+EVENT</w:t>
+            </w:r>
+          </w:p>
+        </w:tc>
+        <w:tc>
+          <w:tcPr>
+            <w:tcW w:type="dxa" w:w="1728"/>
+          </w:tcPr>
+          <w:p>
+            <w:r>
+              <w:rPr>
+                <w:b/>
+              </w:rPr>
+              <w:t>EVENT</w:t>
+            </w:r>
+          </w:p>
+        </w:tc>
+      </w:tr>
+      <w:tr>
+        <w:tc>
+          <w:tcPr>
+            <w:tcW w:type="dxa" w:w="1728"/>
+          </w:tcPr>
+          <w:p>
+            <w:r>
+              <w:t>0.5</w:t>
+            </w:r>
+          </w:p>
+        </w:tc>
+        <w:tc>
+          <w:tcPr>
+            <w:tcW w:type="dxa" w:w="1728"/>
+          </w:tcPr>
+          <w:p>
+            <w:r>
+              <w:t>114 049 €</w:t>
+            </w:r>
+          </w:p>
+        </w:tc>
+        <w:tc>
+          <w:tcPr>
+            <w:tcW w:type="dxa" w:w="1728"/>
+          </w:tcPr>
+          <w:p>
+            <w:r>
+              <w:t>101 007 €</w:t>
+            </w:r>
+          </w:p>
+        </w:tc>
+        <w:tc>
+          <w:tcPr>
+            <w:tcW w:type="dxa" w:w="1728"/>
+          </w:tcPr>
+          <w:p>
+            <w:r>
+              <w:t>113 191 €</w:t>
+            </w:r>
+          </w:p>
+        </w:tc>
+        <w:tc>
+          <w:tcPr>
+            <w:tcW w:type="dxa" w:w="1728"/>
+          </w:tcPr>
+          <w:p>
+            <w:r>
+              <w:t>100 566 €</w:t>
+            </w:r>
+          </w:p>
+        </w:tc>
+      </w:tr>
+      <w:tr>
+        <w:tc>
+          <w:tcPr>
+            <w:tcW w:type="dxa" w:w="1728"/>
+          </w:tcPr>
+          <w:p>
+            <w:r>
+              <w:t>1.0</w:t>
+            </w:r>
+          </w:p>
+        </w:tc>
+        <w:tc>
+          <w:tcPr>
+            <w:tcW w:type="dxa" w:w="1728"/>
+          </w:tcPr>
+          <w:p>
+            <w:r>
+              <w:t>117 336 €</w:t>
+            </w:r>
+          </w:p>
+        </w:tc>
+        <w:tc>
+          <w:tcPr>
+            <w:tcW w:type="dxa" w:w="1728"/>
+          </w:tcPr>
+          <w:p>
+            <w:r>
+              <w:t>98 364 €</w:t>
+            </w:r>
+          </w:p>
+        </w:tc>
+        <w:tc>
+          <w:tcPr>
+            <w:tcW w:type="dxa" w:w="1728"/>
+          </w:tcPr>
+          <w:p>
+            <w:r>
+              <w:t>113 029 €</w:t>
+            </w:r>
+          </w:p>
+        </w:tc>
+        <w:tc>
+          <w:tcPr>
+            <w:tcW w:type="dxa" w:w="1728"/>
+          </w:tcPr>
+          <w:p>
+            <w:r>
+              <w:t>97 655 €</w:t>
+            </w:r>
+          </w:p>
+        </w:tc>
+      </w:tr>
+      <w:tr>
+        <w:tc>
+          <w:tcPr>
+            <w:tcW w:type="dxa" w:w="1728"/>
+          </w:tcPr>
+          <w:p>
+            <w:r>
+              <w:t>1.5</w:t>
+            </w:r>
+          </w:p>
+        </w:tc>
+        <w:tc>
+          <w:tcPr>
+            <w:tcW w:type="dxa" w:w="1728"/>
+          </w:tcPr>
+          <w:p>
+            <w:r>
+              <w:t>119 776 €</w:t>
+            </w:r>
+          </w:p>
+        </w:tc>
+        <w:tc>
+          <w:tcPr>
+            <w:tcW w:type="dxa" w:w="1728"/>
+          </w:tcPr>
+          <w:p>
+            <w:r>
+              <w:t>99 664 €</w:t>
+            </w:r>
+          </w:p>
+        </w:tc>
+        <w:tc>
+          <w:tcPr>
+            <w:tcW w:type="dxa" w:w="1728"/>
+          </w:tcPr>
+          <w:p>
+            <w:r>
+              <w:t>113 464 €</w:t>
+            </w:r>
+          </w:p>
+        </w:tc>
+        <w:tc>
+          <w:tcPr>
+            <w:tcW w:type="dxa" w:w="1728"/>
+          </w:tcPr>
+          <w:p>
+            <w:r>
+              <w:t>99 437 €</w:t>
+            </w:r>
+          </w:p>
+        </w:tc>
+      </w:tr>
+      <w:tr>
+        <w:tc>
+          <w:tcPr>
+            <w:tcW w:type="dxa" w:w="1728"/>
+          </w:tcPr>
+          <w:p>
+            <w:r>
+              <w:t>2.0</w:t>
+            </w:r>
+          </w:p>
+        </w:tc>
+        <w:tc>
+          <w:tcPr>
+            <w:tcW w:type="dxa" w:w="1728"/>
+          </w:tcPr>
+          <w:p>
+            <w:r>
+              <w:t>117 605 €</w:t>
+            </w:r>
+          </w:p>
+        </w:tc>
+        <w:tc>
+          <w:tcPr>
+            <w:tcW w:type="dxa" w:w="1728"/>
+          </w:tcPr>
+          <w:p>
+            <w:r>
+              <w:t>99 990 €</w:t>
+            </w:r>
+          </w:p>
+        </w:tc>
+        <w:tc>
+          <w:tcPr>
+            <w:tcW w:type="dxa" w:w="1728"/>
+          </w:tcPr>
+          <w:p>
+            <w:r>
+              <w:t>113 980 €</w:t>
+            </w:r>
+          </w:p>
+        </w:tc>
+        <w:tc>
+          <w:tcPr>
+            <w:tcW w:type="dxa" w:w="1728"/>
+          </w:tcPr>
+          <w:p>
+            <w:r>
+              <w:t>100 594 €</w:t>
+            </w:r>
+          </w:p>
+        </w:tc>
+      </w:tr>
+      <w:tr>
+        <w:tc>
+          <w:tcPr>
+            <w:tcW w:type="dxa" w:w="1728"/>
+          </w:tcPr>
+          <w:p>
+            <w:r>
+              <w:t>2.5</w:t>
+            </w:r>
+          </w:p>
+        </w:tc>
+        <w:tc>
+          <w:tcPr>
+            <w:tcW w:type="dxa" w:w="1728"/>
+          </w:tcPr>
+          <w:p>
+            <w:r>
+              <w:t>114 925 €</w:t>
+            </w:r>
+          </w:p>
+        </w:tc>
+        <w:tc>
+          <w:tcPr>
+            <w:tcW w:type="dxa" w:w="1728"/>
+          </w:tcPr>
+          <w:p>
+            <w:r>
+              <w:t>100 969 €</w:t>
+            </w:r>
+          </w:p>
+        </w:tc>
+        <w:tc>
+          <w:tcPr>
+            <w:tcW w:type="dxa" w:w="1728"/>
+          </w:tcPr>
+          <w:p>
+            <w:r>
+              <w:t>113 484 €</w:t>
+            </w:r>
+          </w:p>
+        </w:tc>
+        <w:tc>
+          <w:tcPr>
+            <w:tcW w:type="dxa" w:w="1728"/>
+          </w:tcPr>
+          <w:p>
+            <w:r>
+              <w:t>99 499 €</w:t>
+            </w:r>
+          </w:p>
+        </w:tc>
+      </w:tr>
+    </w:tbl>
+    <w:p>
+      <w:r>
+        <w:t>Constat honnête : la courbe est quasi-plate pour les 4 doctrines.</w:t>
+      </w:r>
+    </w:p>
+    <w:p>
+      <w:r>
+        <w:t>Deux interprétations co-existent :</w:t>
+      </w:r>
+    </w:p>
+    <w:p>
+      <w:r>
+        <w:t>1. Robustesse intrinsèque : sur cette fixture industrielle, les</w:t>
+      </w:r>
+    </w:p>
+    <w:p>
+      <w:r>
+        <w:t xml:space="preserve">   doctrines sont déjà saturées par leurs autres contraintes (capacité</w:t>
+      </w:r>
+    </w:p>
+    <w:p>
+      <w:r>
+        <w:t xml:space="preserve">   goulot, BOM, lead time minimum). Augmenter l'amplitude d'un aléa</w:t>
+      </w:r>
+    </w:p>
+    <w:p>
+      <w:r>
+        <w:t xml:space="preserve">   ne déplace pas le point d'équilibre — l'aléa pèse peu face au coût</w:t>
+      </w:r>
+    </w:p>
+    <w:p>
+      <w:r>
+        <w:t xml:space="preserve">   nominal de production.</w:t>
+      </w:r>
+    </w:p>
+    <w:p>
+      <w:r>
+        <w:t>2. Limite méthodologique : _build_intensity_scenario scale la</w:t>
+      </w:r>
+    </w:p>
+    <w:p>
+      <w:r>
+        <w:t xml:space="preserve">   magnitude et la durée des 5 aléas mais conserve leur type/cible.</w:t>
+      </w:r>
+    </w:p>
+    <w:p>
+      <w:r>
+        <w:t xml:space="preserve">   Un protocole plus discriminant ferait varier le nombre d'aléas,</w:t>
+      </w:r>
+    </w:p>
+    <w:p>
+      <w:r>
+        <w:t xml:space="preserve">   pas seulement leur magnitude.</w:t>
+      </w:r>
+    </w:p>
+    <w:p>
+      <w:r>
+        <w:t>La courbe plate ne valide pas la résilience en gradient — elle</w:t>
+      </w:r>
+    </w:p>
+    <w:p>
+      <w:r>
+        <w:t>indique qu'il faut un protocole différent (cf. §24.8.3 cascade qui</w:t>
+      </w:r>
+    </w:p>
+    <w:p>
+      <w:r>
+        <w:t>donne, lui, un gradient clair).</w:t>
+      </w:r>
+    </w:p>
+    <w:p>
+      <w:pPr>
+        <w:jc w:val="center"/>
+      </w:pPr>
+      <w:r>
+        <w:drawing>
+          <wp:inline xmlns:a="http://schemas.openxmlformats.org/drawingml/2006/main" xmlns:pic="http://schemas.openxmlformats.org/drawingml/2006/picture">
+            <wp:extent cx="5669280" cy="2388413"/>
+            <wp:docPr id="6" name="Picture 6"/>
+            <wp:cNvGraphicFramePr>
+              <a:graphicFrameLocks noChangeAspect="1"/>
+            </wp:cNvGraphicFramePr>
+            <a:graphic>
+              <a:graphicData uri="http://schemas.openxmlformats.org/drawingml/2006/picture">
+                <pic:pic>
+                  <pic:nvPicPr>
+                    <pic:cNvPr id="0" name="resilience_gradient.png"/>
+                    <pic:cNvPicPr/>
+                  </pic:nvPicPr>
+                  <pic:blipFill>
+                    <a:blip r:embed="rId14"/>
+                    <a:stretch>
+                      <a:fillRect/>
+                    </a:stretch>
+                  </pic:blipFill>
+                  <pic:spPr>
+                    <a:xfrm>
+                      <a:off x="0" y="0"/>
+                      <a:ext cx="5669280" cy="2388413"/>
+                    </a:xfrm>
+                    <a:prstGeom prst="rect"/>
+                  </pic:spPr>
+                </pic:pic>
+              </a:graphicData>
+            </a:graphic>
+          </wp:inline>
+        </w:drawing>
+      </w:r>
+    </w:p>
+    <w:p>
+      <w:pPr>
+        <w:jc w:val="center"/>
+      </w:pPr>
+      <w:r>
+        <w:rPr>
+          <w:i/>
+          <w:sz w:val="18"/>
+        </w:rPr>
+        <w:t>Coût moyen et P95 vs intensité d'aléa</w:t>
+      </w:r>
+    </w:p>
+    <w:p>
+      <w:r>
+        <w:t>Lecture résilience : la pente de la courbe coût vs intensité</w:t>
+      </w:r>
+    </w:p>
+    <w:p>
+      <w:r>
+        <w:t>mesure la sensibilité doctrinale aux aléas plus durs. Une doctrine</w:t>
+      </w:r>
+    </w:p>
+    <w:p>
+      <w:r>
+        <w:t>résiliente a une pente plus faible. La pente de P95 (panneau de droite)</w:t>
+      </w:r>
+    </w:p>
+    <w:p>
+      <w:r>
+        <w:t>indique la résilience en queue de distribution.</w:t>
+      </w:r>
+    </w:p>
+    <w:p>
+      <w:pPr>
+        <w:pStyle w:val="Heading3"/>
+      </w:pPr>
+      <w:r>
+        <w:t>§24.8.3 Cascade de défaillances simultanées</w:t>
+      </w:r>
+    </w:p>
+    <w:p>
+      <w:r>
+        <w:t>Étude sur 300 runs (5 niveaux × 15 seeds × 4 doctrines). On injecte</w:t>
+      </w:r>
+    </w:p>
+    <w:p>
+      <w:r>
+        <w:t>1 à 5 pannes au jour 3 sur des postes distincts (slowdown ×2.5,</w:t>
+      </w:r>
+    </w:p>
+    <w:p>
+      <w:r>
+        <w:t>durée 3 jours).</w:t>
+      </w:r>
+    </w:p>
+    <w:p>
+      <w:r>
+        <w:t>Coût moyen (€) :</w:t>
+      </w:r>
+    </w:p>
+    <w:tbl>
+      <w:tblPr>
+        <w:tblStyle w:val="LightGrid-Accent1"/>
+        <w:tblW w:type="auto" w:w="0"/>
+        <w:tblLook w:firstColumn="1" w:firstRow="1" w:lastColumn="0" w:lastRow="0" w:noHBand="0" w:noVBand="1" w:val="04A0"/>
+      </w:tblPr>
+      <w:tblGrid>
+        <w:gridCol w:w="1728"/>
+        <w:gridCol w:w="1728"/>
+        <w:gridCol w:w="1728"/>
+        <w:gridCol w:w="1728"/>
+        <w:gridCol w:w="1728"/>
+      </w:tblGrid>
+      <w:tr>
+        <w:tc>
+          <w:tcPr>
+            <w:tcW w:type="dxa" w:w="1728"/>
+          </w:tcPr>
+          <w:p>
+            <w:r>
+              <w:rPr>
+                <w:b/>
+              </w:rPr>
+              <w:t>Pannes</w:t>
+            </w:r>
+          </w:p>
+        </w:tc>
+        <w:tc>
+          <w:tcPr>
+            <w:tcW w:type="dxa" w:w="1728"/>
+          </w:tcPr>
+          <w:p>
+            <w:r>
+              <w:rPr>
+                <w:b/>
+              </w:rPr>
+              <w:t>OF</w:t>
+            </w:r>
+          </w:p>
+        </w:tc>
+        <w:tc>
+          <w:tcPr>
+            <w:tcW w:type="dxa" w:w="1728"/>
+          </w:tcPr>
+          <w:p>
+            <w:r>
+              <w:rPr>
+                <w:b/>
+              </w:rPr>
+              <w:t>FLUX</w:t>
+            </w:r>
+          </w:p>
+        </w:tc>
+        <w:tc>
+          <w:tcPr>
+            <w:tcW w:type="dxa" w:w="1728"/>
+          </w:tcPr>
+          <w:p>
+            <w:r>
+              <w:rPr>
+                <w:b/>
+              </w:rPr>
+              <w:t>OF+EVENT</w:t>
+            </w:r>
+          </w:p>
+        </w:tc>
+        <w:tc>
+          <w:tcPr>
+            <w:tcW w:type="dxa" w:w="1728"/>
+          </w:tcPr>
+          <w:p>
+            <w:r>
+              <w:rPr>
+                <w:b/>
+              </w:rPr>
+              <w:t>EVENT</w:t>
+            </w:r>
+          </w:p>
+        </w:tc>
+      </w:tr>
+      <w:tr>
+        <w:tc>
+          <w:tcPr>
+            <w:tcW w:type="dxa" w:w="1728"/>
+          </w:tcPr>
+          <w:p>
+            <w:r>
+              <w:t>1</w:t>
+            </w:r>
+          </w:p>
+        </w:tc>
+        <w:tc>
+          <w:tcPr>
+            <w:tcW w:type="dxa" w:w="1728"/>
+          </w:tcPr>
+          <w:p>
+            <w:r>
+              <w:t>107 116</w:t>
+            </w:r>
+          </w:p>
+        </w:tc>
+        <w:tc>
+          <w:tcPr>
+            <w:tcW w:type="dxa" w:w="1728"/>
+          </w:tcPr>
+          <w:p>
+            <w:r>
+              <w:t>68 524</w:t>
+            </w:r>
+          </w:p>
+        </w:tc>
+        <w:tc>
+          <w:tcPr>
+            <w:tcW w:type="dxa" w:w="1728"/>
+          </w:tcPr>
+          <w:p>
+            <w:r>
+              <w:t>101 392</w:t>
+            </w:r>
+          </w:p>
+        </w:tc>
+        <w:tc>
+          <w:tcPr>
+            <w:tcW w:type="dxa" w:w="1728"/>
+          </w:tcPr>
+          <w:p>
+            <w:r>
+              <w:t>**67 198**</w:t>
+            </w:r>
+          </w:p>
+        </w:tc>
+      </w:tr>
+      <w:tr>
+        <w:tc>
+          <w:tcPr>
+            <w:tcW w:type="dxa" w:w="1728"/>
+          </w:tcPr>
+          <w:p>
+            <w:r>
+              <w:t>2</w:t>
+            </w:r>
+          </w:p>
+        </w:tc>
+        <w:tc>
+          <w:tcPr>
+            <w:tcW w:type="dxa" w:w="1728"/>
+          </w:tcPr>
+          <w:p>
+            <w:r>
+              <w:t>112 506</w:t>
+            </w:r>
+          </w:p>
+        </w:tc>
+        <w:tc>
+          <w:tcPr>
+            <w:tcW w:type="dxa" w:w="1728"/>
+          </w:tcPr>
+          <w:p>
+            <w:r>
+              <w:t>72 831</w:t>
+            </w:r>
+          </w:p>
+        </w:tc>
+        <w:tc>
+          <w:tcPr>
+            <w:tcW w:type="dxa" w:w="1728"/>
+          </w:tcPr>
+          <w:p>
+            <w:r>
+              <w:t>103 452</w:t>
+            </w:r>
+          </w:p>
+        </w:tc>
+        <w:tc>
+          <w:tcPr>
+            <w:tcW w:type="dxa" w:w="1728"/>
+          </w:tcPr>
+          <w:p>
+            <w:r>
+              <w:t>**68 398**</w:t>
+            </w:r>
+          </w:p>
+        </w:tc>
+      </w:tr>
+      <w:tr>
+        <w:tc>
+          <w:tcPr>
+            <w:tcW w:type="dxa" w:w="1728"/>
+          </w:tcPr>
+          <w:p>
+            <w:r>
+              <w:t>3</w:t>
+            </w:r>
+          </w:p>
+        </w:tc>
+        <w:tc>
+          <w:tcPr>
+            <w:tcW w:type="dxa" w:w="1728"/>
+          </w:tcPr>
+          <w:p>
+            <w:r>
+              <w:t>120 826</w:t>
+            </w:r>
+          </w:p>
+        </w:tc>
+        <w:tc>
+          <w:tcPr>
+            <w:tcW w:type="dxa" w:w="1728"/>
+          </w:tcPr>
+          <w:p>
+            <w:r>
+              <w:t>75 345</w:t>
+            </w:r>
+          </w:p>
+        </w:tc>
+        <w:tc>
+          <w:tcPr>
+            <w:tcW w:type="dxa" w:w="1728"/>
+          </w:tcPr>
+          <w:p>
+            <w:r>
+              <w:t>105 518</w:t>
+            </w:r>
+          </w:p>
+        </w:tc>
+        <w:tc>
+          <w:tcPr>
+            <w:tcW w:type="dxa" w:w="1728"/>
+          </w:tcPr>
+          <w:p>
+            <w:r>
+              <w:t>**69 145**</w:t>
+            </w:r>
+          </w:p>
+        </w:tc>
+      </w:tr>
+      <w:tr>
+        <w:tc>
+          <w:tcPr>
+            <w:tcW w:type="dxa" w:w="1728"/>
+          </w:tcPr>
+          <w:p>
+            <w:r>
+              <w:t>4</w:t>
+            </w:r>
+          </w:p>
+        </w:tc>
+        <w:tc>
+          <w:tcPr>
+            <w:tcW w:type="dxa" w:w="1728"/>
+          </w:tcPr>
+          <w:p>
+            <w:r>
+              <w:t>127 923</w:t>
+            </w:r>
+          </w:p>
+        </w:tc>
+        <w:tc>
+          <w:tcPr>
+            <w:tcW w:type="dxa" w:w="1728"/>
+          </w:tcPr>
+          <w:p>
+            <w:r>
+              <w:t>78 276</w:t>
+            </w:r>
+          </w:p>
+        </w:tc>
+        <w:tc>
+          <w:tcPr>
+            <w:tcW w:type="dxa" w:w="1728"/>
+          </w:tcPr>
+          <w:p>
+            <w:r>
+              <w:t>107 685</w:t>
+            </w:r>
+          </w:p>
+        </w:tc>
+        <w:tc>
+          <w:tcPr>
+            <w:tcW w:type="dxa" w:w="1728"/>
+          </w:tcPr>
+          <w:p>
+            <w:r>
+              <w:t>**70 087**</w:t>
+            </w:r>
+          </w:p>
+        </w:tc>
+      </w:tr>
+      <w:tr>
+        <w:tc>
+          <w:tcPr>
+            <w:tcW w:type="dxa" w:w="1728"/>
+          </w:tcPr>
+          <w:p>
+            <w:r>
+              <w:t>5</w:t>
+            </w:r>
+          </w:p>
+        </w:tc>
+        <w:tc>
+          <w:tcPr>
+            <w:tcW w:type="dxa" w:w="1728"/>
+          </w:tcPr>
+          <w:p>
+            <w:r>
+              <w:t>131 954</w:t>
+            </w:r>
+          </w:p>
+        </w:tc>
+        <w:tc>
+          <w:tcPr>
+            <w:tcW w:type="dxa" w:w="1728"/>
+          </w:tcPr>
+          <w:p>
+            <w:r>
+              <w:t>80 370</w:t>
+            </w:r>
+          </w:p>
+        </w:tc>
+        <w:tc>
+          <w:tcPr>
+            <w:tcW w:type="dxa" w:w="1728"/>
+          </w:tcPr>
+          <w:p>
+            <w:r>
+              <w:t>110 331</w:t>
+            </w:r>
+          </w:p>
+        </w:tc>
+        <w:tc>
+          <w:tcPr>
+            <w:tcW w:type="dxa" w:w="1728"/>
+          </w:tcPr>
+          <w:p>
+            <w:r>
+              <w:t>**70 247**</w:t>
+            </w:r>
+          </w:p>
+        </w:tc>
+      </w:tr>
+    </w:tbl>
+    <w:p>
+      <w:r>
+        <w:t>Δ relatif 1→5 pannes (sensibilité au choc) :</w:t>
+      </w:r>
+    </w:p>
+    <w:tbl>
+      <w:tblPr>
+        <w:tblStyle w:val="LightGrid-Accent1"/>
+        <w:tblW w:type="auto" w:w="0"/>
+        <w:tblLook w:firstColumn="1" w:firstRow="1" w:lastColumn="0" w:lastRow="0" w:noHBand="0" w:noVBand="1" w:val="04A0"/>
+      </w:tblPr>
+      <w:tblGrid>
+        <w:gridCol w:w="2160"/>
+        <w:gridCol w:w="2160"/>
+        <w:gridCol w:w="2160"/>
+        <w:gridCol w:w="2160"/>
+      </w:tblGrid>
+      <w:tr>
+        <w:tc>
+          <w:tcPr>
+            <w:tcW w:type="dxa" w:w="2160"/>
+          </w:tcPr>
+          <w:p>
+            <w:r>
+              <w:rPr>
+                <w:b/>
+              </w:rPr>
+              <w:t>Doctrine</w:t>
+            </w:r>
+          </w:p>
+        </w:tc>
+        <w:tc>
+          <w:tcPr>
+            <w:tcW w:type="dxa" w:w="2160"/>
+          </w:tcPr>
+          <w:p>
+            <w:r>
+              <w:rPr>
+                <w:b/>
+              </w:rPr>
+              <w:t>1 panne</w:t>
+            </w:r>
+          </w:p>
+        </w:tc>
+        <w:tc>
+          <w:tcPr>
+            <w:tcW w:type="dxa" w:w="2160"/>
+          </w:tcPr>
+          <w:p>
+            <w:r>
+              <w:rPr>
+                <w:b/>
+              </w:rPr>
+              <w:t>5 pannes</w:t>
+            </w:r>
+          </w:p>
+        </w:tc>
+        <w:tc>
+          <w:tcPr>
+            <w:tcW w:type="dxa" w:w="2160"/>
+          </w:tcPr>
+          <w:p>
+            <w:r>
+              <w:rPr>
+                <w:b/>
+              </w:rPr>
+              <w:t>Pente</w:t>
+            </w:r>
+          </w:p>
+        </w:tc>
+      </w:tr>
+      <w:tr>
+        <w:tc>
+          <w:tcPr>
+            <w:tcW w:type="dxa" w:w="2160"/>
+          </w:tcPr>
+          <w:p>
+            <w:r>
+              <w:t>OF</w:t>
+            </w:r>
+          </w:p>
+        </w:tc>
+        <w:tc>
+          <w:tcPr>
+            <w:tcW w:type="dxa" w:w="2160"/>
+          </w:tcPr>
+          <w:p>
+            <w:r>
+              <w:t>107 116</w:t>
+            </w:r>
+          </w:p>
+        </w:tc>
+        <w:tc>
+          <w:tcPr>
+            <w:tcW w:type="dxa" w:w="2160"/>
+          </w:tcPr>
+          <w:p>
+            <w:r>
+              <w:t>131 954</w:t>
+            </w:r>
+          </w:p>
+        </w:tc>
+        <w:tc>
+          <w:tcPr>
+            <w:tcW w:type="dxa" w:w="2160"/>
+          </w:tcPr>
+          <w:p>
+            <w:r>
+              <w:t>**+23.2 %**</w:t>
+            </w:r>
+          </w:p>
+        </w:tc>
+      </w:tr>
+      <w:tr>
+        <w:tc>
+          <w:tcPr>
+            <w:tcW w:type="dxa" w:w="2160"/>
+          </w:tcPr>
+          <w:p>
+            <w:r>
+              <w:t>FLUX</w:t>
+            </w:r>
+          </w:p>
+        </w:tc>
+        <w:tc>
+          <w:tcPr>
+            <w:tcW w:type="dxa" w:w="2160"/>
+          </w:tcPr>
+          <w:p>
+            <w:r>
+              <w:t>68 524</w:t>
+            </w:r>
+          </w:p>
+        </w:tc>
+        <w:tc>
+          <w:tcPr>
+            <w:tcW w:type="dxa" w:w="2160"/>
+          </w:tcPr>
+          <w:p>
+            <w:r>
+              <w:t>80 370</w:t>
+            </w:r>
+          </w:p>
+        </w:tc>
+        <w:tc>
+          <w:tcPr>
+            <w:tcW w:type="dxa" w:w="2160"/>
+          </w:tcPr>
+          <w:p>
+            <w:r>
+              <w:t>+17.3 %</w:t>
+            </w:r>
+          </w:p>
+        </w:tc>
+      </w:tr>
+      <w:tr>
+        <w:tc>
+          <w:tcPr>
+            <w:tcW w:type="dxa" w:w="2160"/>
+          </w:tcPr>
+          <w:p>
+            <w:r>
+              <w:t>OF+EVENT</w:t>
+            </w:r>
+          </w:p>
+        </w:tc>
+        <w:tc>
+          <w:tcPr>
+            <w:tcW w:type="dxa" w:w="2160"/>
+          </w:tcPr>
+          <w:p>
+            <w:r>
+              <w:t>101 392</w:t>
+            </w:r>
+          </w:p>
+        </w:tc>
+        <w:tc>
+          <w:tcPr>
+            <w:tcW w:type="dxa" w:w="2160"/>
+          </w:tcPr>
+          <w:p>
+            <w:r>
+              <w:t>110 331</w:t>
+            </w:r>
+          </w:p>
+        </w:tc>
+        <w:tc>
+          <w:tcPr>
+            <w:tcW w:type="dxa" w:w="2160"/>
+          </w:tcPr>
+          <w:p>
+            <w:r>
+              <w:t>+8.8 %</w:t>
+            </w:r>
+          </w:p>
+        </w:tc>
+      </w:tr>
+      <w:tr>
+        <w:tc>
+          <w:tcPr>
+            <w:tcW w:type="dxa" w:w="2160"/>
+          </w:tcPr>
+          <w:p>
+            <w:r>
+              <w:t>**EVENT**</w:t>
+            </w:r>
+          </w:p>
+        </w:tc>
+        <w:tc>
+          <w:tcPr>
+            <w:tcW w:type="dxa" w:w="2160"/>
+          </w:tcPr>
+          <w:p>
+            <w:r>
+              <w:t>67 198</w:t>
+            </w:r>
+          </w:p>
+        </w:tc>
+        <w:tc>
+          <w:tcPr>
+            <w:tcW w:type="dxa" w:w="2160"/>
+          </w:tcPr>
+          <w:p>
+            <w:r>
+              <w:t>70 247</w:t>
+            </w:r>
+          </w:p>
+        </w:tc>
+        <w:tc>
+          <w:tcPr>
+            <w:tcW w:type="dxa" w:w="2160"/>
+          </w:tcPr>
+          <w:p>
+            <w:r>
+              <w:t>**+4.5 %**</w:t>
+            </w:r>
+          </w:p>
+        </w:tc>
+      </w:tr>
+    </w:tbl>
+    <w:p>
+      <w:r>
+        <w:t>Time-to-recover (jours) — proxy MTTR, retour du WIP sous</w:t>
+      </w:r>
+    </w:p>
+    <w:p>
+      <w:r>
+        <w:t>médiane × 1.30 :</w:t>
+      </w:r>
+    </w:p>
+    <w:tbl>
+      <w:tblPr>
+        <w:tblStyle w:val="LightGrid-Accent1"/>
+        <w:tblW w:type="auto" w:w="0"/>
+        <w:tblLook w:firstColumn="1" w:firstRow="1" w:lastColumn="0" w:lastRow="0" w:noHBand="0" w:noVBand="1" w:val="04A0"/>
+      </w:tblPr>
+      <w:tblGrid>
+        <w:gridCol w:w="1728"/>
+        <w:gridCol w:w="1728"/>
+        <w:gridCol w:w="1728"/>
+        <w:gridCol w:w="1728"/>
+        <w:gridCol w:w="1728"/>
+      </w:tblGrid>
+      <w:tr>
+        <w:tc>
+          <w:tcPr>
+            <w:tcW w:type="dxa" w:w="1728"/>
+          </w:tcPr>
+          <w:p>
+            <w:r>
+              <w:rPr>
+                <w:b/>
+              </w:rPr>
+              <w:t>Pannes</w:t>
+            </w:r>
+          </w:p>
+        </w:tc>
+        <w:tc>
+          <w:tcPr>
+            <w:tcW w:type="dxa" w:w="1728"/>
+          </w:tcPr>
+          <w:p>
+            <w:r>
+              <w:rPr>
+                <w:b/>
+              </w:rPr>
+              <w:t>OF</w:t>
+            </w:r>
+          </w:p>
+        </w:tc>
+        <w:tc>
+          <w:tcPr>
+            <w:tcW w:type="dxa" w:w="1728"/>
+          </w:tcPr>
+          <w:p>
+            <w:r>
+              <w:rPr>
+                <w:b/>
+              </w:rPr>
+              <w:t>FLUX</w:t>
+            </w:r>
+          </w:p>
+        </w:tc>
+        <w:tc>
+          <w:tcPr>
+            <w:tcW w:type="dxa" w:w="1728"/>
+          </w:tcPr>
+          <w:p>
+            <w:r>
+              <w:rPr>
+                <w:b/>
+              </w:rPr>
+              <w:t>OF+EVENT</w:t>
+            </w:r>
+          </w:p>
+        </w:tc>
+        <w:tc>
+          <w:tcPr>
+            <w:tcW w:type="dxa" w:w="1728"/>
+          </w:tcPr>
+          <w:p>
+            <w:r>
+              <w:rPr>
+                <w:b/>
+              </w:rPr>
+              <w:t>EVENT</w:t>
+            </w:r>
+          </w:p>
+        </w:tc>
+      </w:tr>
+      <w:tr>
+        <w:tc>
+          <w:tcPr>
+            <w:tcW w:type="dxa" w:w="1728"/>
+          </w:tcPr>
+          <w:p>
+            <w:r>
+              <w:t>1</w:t>
+            </w:r>
+          </w:p>
+        </w:tc>
+        <w:tc>
+          <w:tcPr>
+            <w:tcW w:type="dxa" w:w="1728"/>
+          </w:tcPr>
+          <w:p>
+            <w:r>
+              <w:t>5.8</w:t>
+            </w:r>
+          </w:p>
+        </w:tc>
+        <w:tc>
+          <w:tcPr>
+            <w:tcW w:type="dxa" w:w="1728"/>
+          </w:tcPr>
+          <w:p>
+            <w:r>
+              <w:t>3.0</w:t>
+            </w:r>
+          </w:p>
+        </w:tc>
+        <w:tc>
+          <w:tcPr>
+            <w:tcW w:type="dxa" w:w="1728"/>
+          </w:tcPr>
+          <w:p>
+            <w:r>
+              <w:t>5.7</w:t>
+            </w:r>
+          </w:p>
+        </w:tc>
+        <w:tc>
+          <w:tcPr>
+            <w:tcW w:type="dxa" w:w="1728"/>
+          </w:tcPr>
+          <w:p>
+            <w:r>
+              <w:t>**2.9**</w:t>
+            </w:r>
+          </w:p>
+        </w:tc>
+      </w:tr>
+      <w:tr>
+        <w:tc>
+          <w:tcPr>
+            <w:tcW w:type="dxa" w:w="1728"/>
+          </w:tcPr>
+          <w:p>
+            <w:r>
+              <w:t>2</w:t>
+            </w:r>
+          </w:p>
+        </w:tc>
+        <w:tc>
+          <w:tcPr>
+            <w:tcW w:type="dxa" w:w="1728"/>
+          </w:tcPr>
+          <w:p>
+            <w:r>
+              <w:t>5.9</w:t>
+            </w:r>
+          </w:p>
+        </w:tc>
+        <w:tc>
+          <w:tcPr>
+            <w:tcW w:type="dxa" w:w="1728"/>
+          </w:tcPr>
+          <w:p>
+            <w:r>
+              <w:t>3.5</w:t>
+            </w:r>
+          </w:p>
+        </w:tc>
+        <w:tc>
+          <w:tcPr>
+            <w:tcW w:type="dxa" w:w="1728"/>
+          </w:tcPr>
+          <w:p>
+            <w:r>
+              <w:t>5.7</w:t>
+            </w:r>
+          </w:p>
+        </w:tc>
+        <w:tc>
+          <w:tcPr>
+            <w:tcW w:type="dxa" w:w="1728"/>
+          </w:tcPr>
+          <w:p>
+            <w:r>
+              <w:t>**3.0**</w:t>
+            </w:r>
+          </w:p>
+        </w:tc>
+      </w:tr>
+      <w:tr>
+        <w:tc>
+          <w:tcPr>
+            <w:tcW w:type="dxa" w:w="1728"/>
+          </w:tcPr>
+          <w:p>
+            <w:r>
+              <w:t>3</w:t>
+            </w:r>
+          </w:p>
+        </w:tc>
+        <w:tc>
+          <w:tcPr>
+            <w:tcW w:type="dxa" w:w="1728"/>
+          </w:tcPr>
+          <w:p>
+            <w:r>
+              <w:t>5.9</w:t>
+            </w:r>
+          </w:p>
+        </w:tc>
+        <w:tc>
+          <w:tcPr>
+            <w:tcW w:type="dxa" w:w="1728"/>
+          </w:tcPr>
+          <w:p>
+            <w:r>
+              <w:t>3.9</w:t>
+            </w:r>
+          </w:p>
+        </w:tc>
+        <w:tc>
+          <w:tcPr>
+            <w:tcW w:type="dxa" w:w="1728"/>
+          </w:tcPr>
+          <w:p>
+            <w:r>
+              <w:t>5.7</w:t>
+            </w:r>
+          </w:p>
+        </w:tc>
+        <w:tc>
+          <w:tcPr>
+            <w:tcW w:type="dxa" w:w="1728"/>
+          </w:tcPr>
+          <w:p>
+            <w:r>
+              <w:t>**3.1**</w:t>
+            </w:r>
+          </w:p>
+        </w:tc>
+      </w:tr>
+      <w:tr>
+        <w:tc>
+          <w:tcPr>
+            <w:tcW w:type="dxa" w:w="1728"/>
+          </w:tcPr>
+          <w:p>
+            <w:r>
+              <w:t>4</w:t>
+            </w:r>
+          </w:p>
+        </w:tc>
+        <w:tc>
+          <w:tcPr>
+            <w:tcW w:type="dxa" w:w="1728"/>
+          </w:tcPr>
+          <w:p>
+            <w:r>
+              <w:t>5.7</w:t>
+            </w:r>
+          </w:p>
+        </w:tc>
+        <w:tc>
+          <w:tcPr>
+            <w:tcW w:type="dxa" w:w="1728"/>
+          </w:tcPr>
+          <w:p>
+            <w:r>
+              <w:t>4.9</w:t>
+            </w:r>
+          </w:p>
+        </w:tc>
+        <w:tc>
+          <w:tcPr>
+            <w:tcW w:type="dxa" w:w="1728"/>
+          </w:tcPr>
+          <w:p>
+            <w:r>
+              <w:t>5.7</w:t>
+            </w:r>
+          </w:p>
+        </w:tc>
+        <w:tc>
+          <w:tcPr>
+            <w:tcW w:type="dxa" w:w="1728"/>
+          </w:tcPr>
+          <w:p>
+            <w:r>
+              <w:t>**3.5**</w:t>
+            </w:r>
+          </w:p>
+        </w:tc>
+      </w:tr>
+      <w:tr>
+        <w:tc>
+          <w:tcPr>
+            <w:tcW w:type="dxa" w:w="1728"/>
+          </w:tcPr>
+          <w:p>
+            <w:r>
+              <w:t>5</w:t>
+            </w:r>
+          </w:p>
+        </w:tc>
+        <w:tc>
+          <w:tcPr>
+            <w:tcW w:type="dxa" w:w="1728"/>
+          </w:tcPr>
+          <w:p>
+            <w:r>
+              <w:t>5.5</w:t>
+            </w:r>
+          </w:p>
+        </w:tc>
+        <w:tc>
+          <w:tcPr>
+            <w:tcW w:type="dxa" w:w="1728"/>
+          </w:tcPr>
+          <w:p>
+            <w:r>
+              <w:t>5.1</w:t>
+            </w:r>
+          </w:p>
+        </w:tc>
+        <w:tc>
+          <w:tcPr>
+            <w:tcW w:type="dxa" w:w="1728"/>
+          </w:tcPr>
+          <w:p>
+            <w:r>
+              <w:t>5.7</w:t>
+            </w:r>
+          </w:p>
+        </w:tc>
+        <w:tc>
+          <w:tcPr>
+            <w:tcW w:type="dxa" w:w="1728"/>
+          </w:tcPr>
+          <w:p>
+            <w:r>
+              <w:t>**3.5**</w:t>
+            </w:r>
+          </w:p>
+        </w:tc>
+      </w:tr>
+    </w:tbl>
+    <w:p>
+      <w:r>
+        <w:t>EVENT est la doctrine la plus résiliente sur ce protocole :</w:t>
+      </w:r>
+    </w:p>
+    <w:p>
+      <w:r>
+        <w:t>sensibilité 5× plus faible que OF (+4.5 % vs +23.2 %), et MTTR 1.5 à 2×</w:t>
+      </w:r>
+    </w:p>
+    <w:p>
+      <w:r>
+        <w:t>plus court que OF/OF+EVENT.</w:t>
+      </w:r>
+    </w:p>
+    <w:p>
+      <w:pPr>
+        <w:jc w:val="center"/>
+      </w:pPr>
+      <w:r>
+        <w:drawing>
+          <wp:inline xmlns:a="http://schemas.openxmlformats.org/drawingml/2006/main" xmlns:pic="http://schemas.openxmlformats.org/drawingml/2006/picture">
+            <wp:extent cx="5669280" cy="2388413"/>
+            <wp:docPr id="7" name="Picture 7"/>
+            <wp:cNvGraphicFramePr>
+              <a:graphicFrameLocks noChangeAspect="1"/>
+            </wp:cNvGraphicFramePr>
+            <a:graphic>
+              <a:graphicData uri="http://schemas.openxmlformats.org/drawingml/2006/picture">
+                <pic:pic>
+                  <pic:nvPicPr>
+                    <pic:cNvPr id="0" name="resilience_cascade.png"/>
+                    <pic:cNvPicPr/>
+                  </pic:nvPicPr>
+                  <pic:blipFill>
+                    <a:blip r:embed="rId15"/>
+                    <a:stretch>
+                      <a:fillRect/>
+                    </a:stretch>
+                  </pic:blipFill>
+                  <pic:spPr>
+                    <a:xfrm>
+                      <a:off x="0" y="0"/>
+                      <a:ext cx="5669280" cy="2388413"/>
+                    </a:xfrm>
+                    <a:prstGeom prst="rect"/>
+                  </pic:spPr>
+                </pic:pic>
+              </a:graphicData>
+            </a:graphic>
+          </wp:inline>
+        </w:drawing>
+      </w:r>
+    </w:p>
+    <w:p>
+      <w:pPr>
+        <w:jc w:val="center"/>
+      </w:pPr>
+      <w:r>
+        <w:rPr>
+          <w:i/>
+          <w:sz w:val="18"/>
+        </w:rPr>
+        <w:t>Coût et recovery time vs N pannes simultanées</w:t>
+      </w:r>
+    </w:p>
+    <w:p>
+      <w:r>
+        <w:t>Lecture résilience : on injecte 1 à 5 pannes au jour 3 sur des</w:t>
+      </w:r>
+    </w:p>
+    <w:p>
+      <w:r>
+        <w:t>postes distincts. Une doctrine résiliente conserve un coût quasi-stable</w:t>
+      </w:r>
+    </w:p>
+    <w:p>
+      <w:r>
+        <w:t>et un time-to-recover faible quand N augmente. Le panneau de droite</w:t>
+      </w:r>
+    </w:p>
+    <w:p>
+      <w:r>
+        <w:t>est le proxy MTTR : nombre de jours nécessaires pour que le WIP</w:t>
+      </w:r>
+    </w:p>
+    <w:p>
+      <w:r>
+        <w:t>redescende sous le seuil de régime normal après le pic du choc.</w:t>
+      </w:r>
+    </w:p>
+    <w:p>
+      <w:pPr>
+        <w:pStyle w:val="Heading3"/>
+      </w:pPr>
+      <w:r>
+        <w:t>§24.8.4 Lecture honnête</w:t>
+      </w:r>
+    </w:p>
+    <w:p>
+      <w:r>
+        <w:t>Ce que les 856 runs démontrent :</w:t>
+      </w:r>
+    </w:p>
+    <w:p>
+      <w:pPr>
+        <w:pStyle w:val="ListBullet"/>
+      </w:pPr>
+      <w:r>
+        <w:t>EVENT a la queue de distribution la plus favorable (P95 = 220 793 €</w:t>
+      </w:r>
+    </w:p>
+    <w:p>
+      <w:r>
+        <w:t xml:space="preserve">  vs 261 855 € pour OF, soit 16 % de mieux sur le risque P95).</w:t>
+      </w:r>
+    </w:p>
+    <w:p>
+      <w:pPr>
+        <w:pStyle w:val="ListBullet"/>
+      </w:pPr>
+      <w:r>
+        <w:t>EVENT est **5 × moins sensible** que OF à la cascade de pannes</w:t>
+      </w:r>
+    </w:p>
+    <w:p>
+      <w:r>
+        <w:t xml:space="preserve">  (+4.5 % vs +23.2 % entre 1 et 5 pannes simultanées).</w:t>
+      </w:r>
+    </w:p>
+    <w:p>
+      <w:pPr>
+        <w:pStyle w:val="ListBullet"/>
+      </w:pPr>
+      <w:r>
+        <w:t>EVENT récupère **1.6 à 2 × plus vite** que OF après un choc</w:t>
+      </w:r>
+    </w:p>
+    <w:p>
+      <w:r>
+        <w:t xml:space="preserve">  (MTTR 2.9–3.5 j vs 5.5–5.9 j).</w:t>
+      </w:r>
+    </w:p>
+    <w:p>
+      <w:pPr>
+        <w:pStyle w:val="ListBullet"/>
+      </w:pPr>
+      <w:r>
+        <w:t>OF+EVENT (event sourcing sans flux) absorbe le choc côté **coût**</w:t>
+      </w:r>
+    </w:p>
+    <w:p>
+      <w:r>
+        <w:t xml:space="preserve">  mais pas côté MTTR : preuve qu'event sourcing et flux jouent</w:t>
+      </w:r>
+    </w:p>
+    <w:p>
+      <w:r>
+        <w:t xml:space="preserve">  sur des leviers complémentaires de résilience.</w:t>
+      </w:r>
+    </w:p>
+    <w:p>
+      <w:r>
+        <w:t>Ce que les 856 runs ne démontrent pas :</w:t>
+      </w:r>
+    </w:p>
+    <w:p>
+      <w:pPr>
+        <w:pStyle w:val="ListBullet"/>
+      </w:pPr>
+      <w:r>
+        <w:t>Le gradient d'intensité §24.8.2 est plat → le protocole ne</w:t>
+      </w:r>
+    </w:p>
+    <w:p>
+      <w:r>
+        <w:t xml:space="preserve">  discrimine pas les amplitudes d'aléas isolées.</w:t>
+      </w:r>
+    </w:p>
+    <w:p>
+      <w:pPr>
+        <w:pStyle w:val="ListBullet"/>
+      </w:pPr>
+      <w:r>
+        <w:t>Pas d'observation d'atelier réel, pas de loi de probabilité physique</w:t>
+      </w:r>
+    </w:p>
+    <w:p>
+      <w:r>
+        <w:t xml:space="preserve">  des pannes calibrée. Ces chiffres ne valident pas un MTBF ou</w:t>
+      </w:r>
+    </w:p>
+    <w:p>
+      <w:r>
+        <w:t xml:space="preserve">  une disponibilité au sens IEC 60050.</w:t>
+      </w:r>
+    </w:p>
+    <w:p>
+      <w:pPr>
+        <w:pStyle w:val="ListBullet"/>
+      </w:pPr>
+      <w:r>
+        <w:t>L'avantage EVENT ici est mesuré uniquement sur **5 pannes max</w:t>
+      </w:r>
+    </w:p>
+    <w:p>
+      <w:r>
+        <w:t xml:space="preserve">  simultanées** sur 1 fixture industrielle. La généralisation à</w:t>
+      </w:r>
+    </w:p>
+    <w:p>
+      <w:r>
+        <w:t xml:space="preserve">  d'autres ateliers reste à démontrer.</w:t>
+      </w:r>
+    </w:p>
+    <w:p>
+      <w:r>
+        <w:t>Verdict résilience : sur le protocole simulé, la doctrine</w:t>
+      </w:r>
+    </w:p>
+    <w:p>
+      <w:r>
+        <w:t>EVENT (flux + event sourcing) est la plus résiliente des 4. Le</w:t>
+      </w:r>
+    </w:p>
+    <w:p>
+      <w:r>
+        <w:t>flux seul (FLUX) absorbe le choc mais récupère plus lentement quand</w:t>
+      </w:r>
+    </w:p>
+    <w:p>
+      <w:r>
+        <w:t>le nombre de pannes augmente (MTTR 3.0 → 5.1 j). L'event sourcing seul</w:t>
+      </w:r>
+    </w:p>
+    <w:p>
+      <w:r>
+        <w:t>(OF+EVENT) ne récupère pas mieux que OF — sa contribution résilience</w:t>
+      </w:r>
+    </w:p>
+    <w:p>
+      <w:r>
+        <w:t>passe par le couplage avec le flux.</w:t>
       </w:r>
     </w:p>
     <w:p/>

</xml_diff>

<commit_message>
docs(validity): integration §7.1 OF_MILP + §7.3 sensibilité
§7.1 — Test du biais d'implémentation (250 runs) :
  - OF_MILP (CP-SAT) vs OF heuristique : -0.1% sur coût, -11% lead time
  - Le gain doctrinal FLUX/EVENT n'est pas un artefact de baseline
  - L'écart FLUX vs OF_MILP reste de -26.7% (vs -26.8% vs OF)
  - Biais d'implémentation borné par 0.1% → conclusions intactes

§7.3 — Sensibilité paramétrique (480 runs, 3 params × 4 niveaux) :
  - Intensité scrap : gain FLUX vs OF entre -10.9% et -26.7%
  - Horizon planification : gain entre -19.9% et -31.7%
  - Nombre d'aléas : gain entre -7.8% et -25.8%
  - Gain doctrinal positif sur les 12/12 cellules testées
  - Robuste sur 1 ordre de grandeur de variation par paramètre

Intégration dans paper_hal_v1.md §7.1 et §7.3 + cadrage_v4.md §24.11
+ 2 nouvelles figures (Fig 14 MILP, Fig 15 sensibilité).
DOCX paper passe à 1.33 MB (15 figures), cadrage_v4 à 804 KB.
</commit_message>
<xml_diff>
--- a/docs/cadrage_v4.docx
+++ b/docs/cadrage_v4.docx
@@ -13803,6 +13803,529 @@
     <w:p>
       <w:r>
         <w:t>du domaine le plus critique pour l'atelier visé.</w:t>
+      </w:r>
+    </w:p>
+    <w:p/>
+    <w:p>
+      <w:pPr>
+        <w:pStyle w:val="Heading2"/>
+      </w:pPr>
+      <w:r>
+        <w:t>§24.11 Validations méthodologiques (§7.1 + §7.3 paper HAL)</w:t>
+      </w:r>
+    </w:p>
+    <w:p>
+      <w:pPr>
+        <w:pStyle w:val="Heading3"/>
+      </w:pPr>
+      <w:r>
+        <w:t>§24.11.1 Test du biais d'implémentation — OF_MILP (250 runs)</w:t>
+      </w:r>
+    </w:p>
+    <w:p>
+      <w:r>
+        <w:t>Pour valider que le gain doctrinal n'est pas un artefact d'un OF</w:t>
+      </w:r>
+    </w:p>
+    <w:p>
+      <w:r>
+        <w:t>baseline trop naïf, une 5ᵉ doctrine OF_MILP est implémentée avec</w:t>
+      </w:r>
+    </w:p>
+    <w:p>
+      <w:r>
+        <w:t>solveur CP-SAT (Google OR-Tools) :</w:t>
+      </w:r>
+    </w:p>
+    <w:tbl>
+      <w:tblPr>
+        <w:tblStyle w:val="LightGrid-Accent1"/>
+        <w:tblW w:type="auto" w:w="0"/>
+        <w:tblLook w:firstColumn="1" w:firstRow="1" w:lastColumn="0" w:lastRow="0" w:noHBand="0" w:noVBand="1" w:val="04A0"/>
+      </w:tblPr>
+      <w:tblGrid>
+        <w:gridCol w:w="2160"/>
+        <w:gridCol w:w="2160"/>
+        <w:gridCol w:w="2160"/>
+        <w:gridCol w:w="2160"/>
+      </w:tblGrid>
+      <w:tr>
+        <w:tc>
+          <w:tcPr>
+            <w:tcW w:type="dxa" w:w="2160"/>
+          </w:tcPr>
+          <w:p>
+            <w:r>
+              <w:rPr>
+                <w:b/>
+              </w:rPr>
+              <w:t>Doctrine</w:t>
+            </w:r>
+          </w:p>
+        </w:tc>
+        <w:tc>
+          <w:tcPr>
+            <w:tcW w:type="dxa" w:w="2160"/>
+          </w:tcPr>
+          <w:p>
+            <w:r>
+              <w:rPr>
+                <w:b/>
+              </w:rPr>
+              <w:t>Coût moyen</w:t>
+            </w:r>
+          </w:p>
+        </w:tc>
+        <w:tc>
+          <w:tcPr>
+            <w:tcW w:type="dxa" w:w="2160"/>
+          </w:tcPr>
+          <w:p>
+            <w:r>
+              <w:rPr>
+                <w:b/>
+              </w:rPr>
+              <w:t>Lead time</w:t>
+            </w:r>
+          </w:p>
+        </w:tc>
+        <w:tc>
+          <w:tcPr>
+            <w:tcW w:type="dxa" w:w="2160"/>
+          </w:tcPr>
+          <w:p>
+            <w:r>
+              <w:rPr>
+                <w:b/>
+              </w:rPr>
+              <w:t>Δ vs OF</w:t>
+            </w:r>
+          </w:p>
+        </w:tc>
+      </w:tr>
+      <w:tr>
+        <w:tc>
+          <w:tcPr>
+            <w:tcW w:type="dxa" w:w="2160"/>
+          </w:tcPr>
+          <w:p>
+            <w:r>
+              <w:t>OF (SLACK+FIFO)</w:t>
+            </w:r>
+          </w:p>
+        </w:tc>
+        <w:tc>
+          <w:tcPr>
+            <w:tcW w:type="dxa" w:w="2160"/>
+          </w:tcPr>
+          <w:p>
+            <w:r>
+              <w:t>130 089 €</w:t>
+            </w:r>
+          </w:p>
+        </w:tc>
+        <w:tc>
+          <w:tcPr>
+            <w:tcW w:type="dxa" w:w="2160"/>
+          </w:tcPr>
+          <w:p>
+            <w:r>
+              <w:t>7.72 j</w:t>
+            </w:r>
+          </w:p>
+        </w:tc>
+        <w:tc>
+          <w:tcPr>
+            <w:tcW w:type="dxa" w:w="2160"/>
+          </w:tcPr>
+          <w:p>
+            <w:r>
+              <w:t>0 (réf)</w:t>
+            </w:r>
+          </w:p>
+        </w:tc>
+      </w:tr>
+      <w:tr>
+        <w:tc>
+          <w:tcPr>
+            <w:tcW w:type="dxa" w:w="2160"/>
+          </w:tcPr>
+          <w:p>
+            <w:r>
+              <w:t>**OF_MILP (CP-SAT)**</w:t>
+            </w:r>
+          </w:p>
+        </w:tc>
+        <w:tc>
+          <w:tcPr>
+            <w:tcW w:type="dxa" w:w="2160"/>
+          </w:tcPr>
+          <w:p>
+            <w:r>
+              <w:t>**129 959 €**</w:t>
+            </w:r>
+          </w:p>
+        </w:tc>
+        <w:tc>
+          <w:tcPr>
+            <w:tcW w:type="dxa" w:w="2160"/>
+          </w:tcPr>
+          <w:p>
+            <w:r>
+              <w:t>**6.86 j**</w:t>
+            </w:r>
+          </w:p>
+        </w:tc>
+        <w:tc>
+          <w:tcPr>
+            <w:tcW w:type="dxa" w:w="2160"/>
+          </w:tcPr>
+          <w:p>
+            <w:r>
+              <w:t>**−131 € (−0.1 %)**</w:t>
+            </w:r>
+          </w:p>
+        </w:tc>
+      </w:tr>
+      <w:tr>
+        <w:tc>
+          <w:tcPr>
+            <w:tcW w:type="dxa" w:w="2160"/>
+          </w:tcPr>
+          <w:p>
+            <w:r>
+              <w:t>FLUX</w:t>
+            </w:r>
+          </w:p>
+        </w:tc>
+        <w:tc>
+          <w:tcPr>
+            <w:tcW w:type="dxa" w:w="2160"/>
+          </w:tcPr>
+          <w:p>
+            <w:r>
+              <w:t>95 261 €</w:t>
+            </w:r>
+          </w:p>
+        </w:tc>
+        <w:tc>
+          <w:tcPr>
+            <w:tcW w:type="dxa" w:w="2160"/>
+          </w:tcPr>
+          <w:p>
+            <w:r>
+              <w:t>4.63 j</w:t>
+            </w:r>
+          </w:p>
+        </w:tc>
+        <w:tc>
+          <w:tcPr>
+            <w:tcW w:type="dxa" w:w="2160"/>
+          </w:tcPr>
+          <w:p>
+            <w:r>
+              <w:t>**−34 828 €**</w:t>
+            </w:r>
+          </w:p>
+        </w:tc>
+      </w:tr>
+      <w:tr>
+        <w:tc>
+          <w:tcPr>
+            <w:tcW w:type="dxa" w:w="2160"/>
+          </w:tcPr>
+          <w:p>
+            <w:r>
+              <w:t>EVENT</w:t>
+            </w:r>
+          </w:p>
+        </w:tc>
+        <w:tc>
+          <w:tcPr>
+            <w:tcW w:type="dxa" w:w="2160"/>
+          </w:tcPr>
+          <w:p>
+            <w:r>
+              <w:t>90 792 €</w:t>
+            </w:r>
+          </w:p>
+        </w:tc>
+        <w:tc>
+          <w:tcPr>
+            <w:tcW w:type="dxa" w:w="2160"/>
+          </w:tcPr>
+          <w:p>
+            <w:r>
+              <w:t>4.51 j</w:t>
+            </w:r>
+          </w:p>
+        </w:tc>
+        <w:tc>
+          <w:tcPr>
+            <w:tcW w:type="dxa" w:w="2160"/>
+          </w:tcPr>
+          <w:p>
+            <w:r>
+              <w:t>**−39 297 €**</w:t>
+            </w:r>
+          </w:p>
+        </w:tc>
+      </w:tr>
+    </w:tbl>
+    <w:p>
+      <w:r>
+        <w:t>Le solveur CP-SAT améliore le lead time de 11 % mais ne change pas</w:t>
+      </w:r>
+    </w:p>
+    <w:p>
+      <w:r>
+        <w:t>le coût (-0.1 % dans le bruit statistique). **Le gain doctrinal</w:t>
+      </w:r>
+    </w:p>
+    <w:p>
+      <w:r>
+        <w:t>FLUX/EVENT vs OF n'est pas un artefact de baseline** : il provient</w:t>
+      </w:r>
+    </w:p>
+    <w:p>
+      <w:r>
+        <w:t>de l'architecture (lissage + freeze + tampons) qu'un solveur</w:t>
+      </w:r>
+    </w:p>
+    <w:p>
+      <w:r>
+        <w:t>ponctuel n'imite pas.</w:t>
+      </w:r>
+    </w:p>
+    <w:p>
+      <w:pPr>
+        <w:pStyle w:val="Heading3"/>
+      </w:pPr>
+      <w:r>
+        <w:t>§24.11.2 Sensibilité paramétrique (480 runs)</w:t>
+      </w:r>
+    </w:p>
+    <w:p>
+      <w:r>
+        <w:t>Sur 3 paramètres × 4 niveaux (faible / moyen / élevé / extrême), le</w:t>
+      </w:r>
+    </w:p>
+    <w:p>
+      <w:r>
+        <w:t>gain FLUX vs OF est mesuré positif sur les 12 cellules, entre</w:t>
+      </w:r>
+    </w:p>
+    <w:p>
+      <w:r>
+        <w:t>−7.8 % et −31.7 %. Robustesse du gain :</w:t>
+      </w:r>
+    </w:p>
+    <w:tbl>
+      <w:tblPr>
+        <w:tblStyle w:val="LightGrid-Accent1"/>
+        <w:tblW w:type="auto" w:w="0"/>
+        <w:tblLook w:firstColumn="1" w:firstRow="1" w:lastColumn="0" w:lastRow="0" w:noHBand="0" w:noVBand="1" w:val="04A0"/>
+      </w:tblPr>
+      <w:tblGrid>
+        <w:gridCol w:w="2160"/>
+        <w:gridCol w:w="2160"/>
+        <w:gridCol w:w="2160"/>
+        <w:gridCol w:w="2160"/>
+      </w:tblGrid>
+      <w:tr>
+        <w:tc>
+          <w:tcPr>
+            <w:tcW w:type="dxa" w:w="2160"/>
+          </w:tcPr>
+          <w:p>
+            <w:r>
+              <w:rPr>
+                <w:b/>
+              </w:rPr>
+              <w:t>Paramètre</w:t>
+            </w:r>
+          </w:p>
+        </w:tc>
+        <w:tc>
+          <w:tcPr>
+            <w:tcW w:type="dxa" w:w="2160"/>
+          </w:tcPr>
+          <w:p>
+            <w:r>
+              <w:rPr>
+                <w:b/>
+              </w:rPr>
+              <w:t>Gain FLUX vs OF min</w:t>
+            </w:r>
+          </w:p>
+        </w:tc>
+        <w:tc>
+          <w:tcPr>
+            <w:tcW w:type="dxa" w:w="2160"/>
+          </w:tcPr>
+          <w:p>
+            <w:r>
+              <w:rPr>
+                <w:b/>
+              </w:rPr>
+              <w:t>max</w:t>
+            </w:r>
+          </w:p>
+        </w:tc>
+        <w:tc>
+          <w:tcPr>
+            <w:tcW w:type="dxa" w:w="2160"/>
+          </w:tcPr>
+          <w:p>
+            <w:r>
+              <w:rPr>
+                <w:b/>
+              </w:rPr>
+              <w:t>Tendance</w:t>
+            </w:r>
+          </w:p>
+        </w:tc>
+      </w:tr>
+      <w:tr>
+        <w:tc>
+          <w:tcPr>
+            <w:tcW w:type="dxa" w:w="2160"/>
+          </w:tcPr>
+          <w:p>
+            <w:r>
+              <w:t>Intensité scrap</w:t>
+            </w:r>
+          </w:p>
+        </w:tc>
+        <w:tc>
+          <w:tcPr>
+            <w:tcW w:type="dxa" w:w="2160"/>
+          </w:tcPr>
+          <w:p>
+            <w:r>
+              <w:t>−10.9 %</w:t>
+            </w:r>
+          </w:p>
+        </w:tc>
+        <w:tc>
+          <w:tcPr>
+            <w:tcW w:type="dxa" w:w="2160"/>
+          </w:tcPr>
+          <w:p>
+            <w:r>
+              <w:t>−26.7 %</w:t>
+            </w:r>
+          </w:p>
+        </w:tc>
+        <w:tc>
+          <w:tcPr>
+            <w:tcW w:type="dxa" w:w="2160"/>
+          </w:tcPr>
+          <w:p>
+            <w:r>
+              <w:t>gain ↓ si scrap ↑</w:t>
+            </w:r>
+          </w:p>
+        </w:tc>
+      </w:tr>
+      <w:tr>
+        <w:tc>
+          <w:tcPr>
+            <w:tcW w:type="dxa" w:w="2160"/>
+          </w:tcPr>
+          <w:p>
+            <w:r>
+              <w:t>Horizon planification</w:t>
+            </w:r>
+          </w:p>
+        </w:tc>
+        <w:tc>
+          <w:tcPr>
+            <w:tcW w:type="dxa" w:w="2160"/>
+          </w:tcPr>
+          <w:p>
+            <w:r>
+              <w:t>−19.9 %</w:t>
+            </w:r>
+          </w:p>
+        </w:tc>
+        <w:tc>
+          <w:tcPr>
+            <w:tcW w:type="dxa" w:w="2160"/>
+          </w:tcPr>
+          <w:p>
+            <w:r>
+              <w:t>−31.7 %</w:t>
+            </w:r>
+          </w:p>
+        </w:tc>
+        <w:tc>
+          <w:tcPr>
+            <w:tcW w:type="dxa" w:w="2160"/>
+          </w:tcPr>
+          <w:p>
+            <w:r>
+              <w:t>gain ↑ si horizon ↓</w:t>
+            </w:r>
+          </w:p>
+        </w:tc>
+      </w:tr>
+      <w:tr>
+        <w:tc>
+          <w:tcPr>
+            <w:tcW w:type="dxa" w:w="2160"/>
+          </w:tcPr>
+          <w:p>
+            <w:r>
+              <w:t>Nombre d'aléas</w:t>
+            </w:r>
+          </w:p>
+        </w:tc>
+        <w:tc>
+          <w:tcPr>
+            <w:tcW w:type="dxa" w:w="2160"/>
+          </w:tcPr>
+          <w:p>
+            <w:r>
+              <w:t>−7.8 %</w:t>
+            </w:r>
+          </w:p>
+        </w:tc>
+        <w:tc>
+          <w:tcPr>
+            <w:tcW w:type="dxa" w:w="2160"/>
+          </w:tcPr>
+          <w:p>
+            <w:r>
+              <w:t>−25.8 %</w:t>
+            </w:r>
+          </w:p>
+        </w:tc>
+        <w:tc>
+          <w:tcPr>
+            <w:tcW w:type="dxa" w:w="2160"/>
+          </w:tcPr>
+          <w:p>
+            <w:r>
+              <w:t>gain ↓ si aléas ↑</w:t>
+            </w:r>
+          </w:p>
+        </w:tc>
+      </w:tr>
+    </w:tbl>
+    <w:p>
+      <w:r>
+        <w:t>Le gain doctrinal n'est pas un artefact de paramètres choisis :</w:t>
+      </w:r>
+    </w:p>
+    <w:p>
+      <w:r>
+        <w:t>il est robuste sur 4 niveaux d'intensité couvrant 1 ordre de grandeur</w:t>
+      </w:r>
+    </w:p>
+    <w:p>
+      <w:r>
+        <w:t>par paramètre.</w:t>
       </w:r>
     </w:p>
     <w:p/>

</xml_diff>

<commit_message>
docs(V12.6): restructure §28.12 + rebuild cadrage docx
Le commit V12.7 précédent (1f06c99) avait laissé §28.12.4
« Conclusion honnête sur V12.6 » orphelin après §28.13. Restructure :
§28.12.4 est maintenant rattaché à §28.12 (avant §28.13), avec
référence explicite à V12.7 comme correction du défaut Q non
localisé dans le smoothing.

Ajoute aussi le pointeur vers le chart V12.6
(`docs/charts/v12_6_otif_comparative.png`) et la donnée détaillée
(`docs/cadrage_v4_v12_6_data.md`) dans la conclusion §28.12.4.

Rebuild de cadrage_v4.docx pour intégrer §28.12 (V12.6 LIVRÉ +
finding négatif) et §28.13 (V12.7 LIVRÉ + correction défaut Q).

Co-Authored-By: Claude Opus 4.7 <noreply@anthropic.com>
Claude-Session: https://claude.ai/code/session_01Bt4dYNppTgcm8MQQkifzhU
</commit_message>
<xml_diff>
--- a/docs/cadrage_v4.docx
+++ b/docs/cadrage_v4.docx
@@ -15012,16 +15012,6 @@
       </w:r>
     </w:p>
     <w:p>
-      <w:r>
-        <w:t>V12.7 est identifié mais non livré. Reste prioritaire pour</w:t>
-      </w:r>
-    </w:p>
-    <w:p>
-      <w:r>
-        <w:t>fermer la question Q.</w:t>
-      </w:r>
-    </w:p>
-    <w:p>
       <w:pPr>
         <w:pStyle w:val="Heading4"/>
       </w:pPr>
@@ -15056,7 +15046,12 @@
     </w:p>
     <w:p>
       <w:r>
-        <w:t>non localisé dans le smoothing.</w:t>
+        <w:t>non localisé dans le smoothing — confirmé et résolu par V12.7</w:t>
+      </w:r>
+    </w:p>
+    <w:p>
+      <w:r>
+        <w:t>(§28.13).</w:t>
       </w:r>
     </w:p>
     <w:p>
@@ -15072,6 +15067,1040 @@
     <w:p>
       <w:r>
         <w:t>concept marketing.</w:t>
+      </w:r>
+    </w:p>
+    <w:p>
+      <w:r>
+        <w:t>Chart : docs/charts/v12_6_otif_comparative.png.</w:t>
+      </w:r>
+    </w:p>
+    <w:p>
+      <w:r>
+        <w:t>Données détaillées : docs/cadrage_v4_v12_6_data.md.</w:t>
+      </w:r>
+    </w:p>
+    <w:p>
+      <w:pPr>
+        <w:pStyle w:val="Heading3"/>
+      </w:pPr>
+      <w:r>
+        <w:t>§28.13 V12.7 — Horizon-aware smoothing — LIVRÉ (correction du défaut Q)</w:t>
+      </w:r>
+    </w:p>
+    <w:p>
+      <w:r>
+        <w:t>V12.7 a été investigué après l'échec de V12.6. Le diagnostic</w:t>
+      </w:r>
+    </w:p>
+    <w:p>
+      <w:r>
+        <w:t>docs/diagnose_v12_7.py a comparé la quantité à 4 étapes (SO →</w:t>
+      </w:r>
+    </w:p>
+    <w:p>
+      <w:r>
+        <w:t>candidate → OF → qty_good) sur baseline_xl, seed=42 :</w:t>
+      </w:r>
+    </w:p>
+    <w:tbl>
+      <w:tblPr>
+        <w:tblStyle w:val="LightGrid-Accent1"/>
+        <w:tblW w:type="auto" w:w="0"/>
+        <w:tblLook w:firstColumn="1" w:firstRow="1" w:lastColumn="0" w:lastRow="0" w:noHBand="0" w:noVBand="1" w:val="04A0"/>
+      </w:tblPr>
+      <w:tblGrid>
+        <w:gridCol w:w="2160"/>
+        <w:gridCol w:w="2160"/>
+        <w:gridCol w:w="2160"/>
+        <w:gridCol w:w="2160"/>
+      </w:tblGrid>
+      <w:tr>
+        <w:tc>
+          <w:tcPr>
+            <w:tcW w:type="dxa" w:w="2160"/>
+          </w:tcPr>
+          <w:p>
+            <w:r>
+              <w:rPr>
+                <w:b/>
+              </w:rPr>
+              <w:t>Étape</w:t>
+            </w:r>
+          </w:p>
+        </w:tc>
+        <w:tc>
+          <w:tcPr>
+            <w:tcW w:type="dxa" w:w="2160"/>
+          </w:tcPr>
+          <w:p>
+            <w:r>
+              <w:rPr>
+                <w:b/>
+              </w:rPr>
+              <w:t>OF</w:t>
+            </w:r>
+          </w:p>
+        </w:tc>
+        <w:tc>
+          <w:tcPr>
+            <w:tcW w:type="dxa" w:w="2160"/>
+          </w:tcPr>
+          <w:p>
+            <w:r>
+              <w:rPr>
+                <w:b/>
+              </w:rPr>
+              <w:t>FLUX</w:t>
+            </w:r>
+          </w:p>
+        </w:tc>
+        <w:tc>
+          <w:tcPr>
+            <w:tcW w:type="dxa" w:w="2160"/>
+          </w:tcPr>
+          <w:p>
+            <w:r>
+              <w:rPr>
+                <w:b/>
+              </w:rPr>
+              <w:t>Δ</w:t>
+            </w:r>
+          </w:p>
+        </w:tc>
+      </w:tr>
+      <w:tr>
+        <w:tc>
+          <w:tcPr>
+            <w:tcW w:type="dxa" w:w="2160"/>
+          </w:tcPr>
+          <w:p>
+            <w:r>
+              <w:t>1. SO.quantity</w:t>
+            </w:r>
+          </w:p>
+        </w:tc>
+        <w:tc>
+          <w:tcPr>
+            <w:tcW w:type="dxa" w:w="2160"/>
+          </w:tcPr>
+          <w:p>
+            <w:r>
+              <w:t>561</w:t>
+            </w:r>
+          </w:p>
+        </w:tc>
+        <w:tc>
+          <w:tcPr>
+            <w:tcW w:type="dxa" w:w="2160"/>
+          </w:tcPr>
+          <w:p>
+            <w:r>
+              <w:t>561</w:t>
+            </w:r>
+          </w:p>
+        </w:tc>
+        <w:tc>
+          <w:tcPr>
+            <w:tcW w:type="dxa" w:w="2160"/>
+          </w:tcPr>
+          <w:p>
+            <w:r>
+              <w:t>0 (identique)</w:t>
+            </w:r>
+          </w:p>
+        </w:tc>
+      </w:tr>
+      <w:tr>
+        <w:tc>
+          <w:tcPr>
+            <w:tcW w:type="dxa" w:w="2160"/>
+          </w:tcPr>
+          <w:p>
+            <w:r>
+              <w:t>2. candidate_orders.quantity</w:t>
+            </w:r>
+          </w:p>
+        </w:tc>
+        <w:tc>
+          <w:tcPr>
+            <w:tcW w:type="dxa" w:w="2160"/>
+          </w:tcPr>
+          <w:p>
+            <w:r>
+              <w:t>1683</w:t>
+            </w:r>
+          </w:p>
+        </w:tc>
+        <w:tc>
+          <w:tcPr>
+            <w:tcW w:type="dxa" w:w="2160"/>
+          </w:tcPr>
+          <w:p>
+            <w:r>
+              <w:t>1683</w:t>
+            </w:r>
+          </w:p>
+        </w:tc>
+        <w:tc>
+          <w:tcPr>
+            <w:tcW w:type="dxa" w:w="2160"/>
+          </w:tcPr>
+          <w:p>
+            <w:r>
+              <w:t>0 (BOM × 3, identique)</w:t>
+            </w:r>
+          </w:p>
+        </w:tc>
+      </w:tr>
+      <w:tr>
+        <w:tc>
+          <w:tcPr>
+            <w:tcW w:type="dxa" w:w="2160"/>
+          </w:tcPr>
+          <w:p>
+            <w:r>
+              <w:t>3. manufacturing_orders.quantity</w:t>
+            </w:r>
+          </w:p>
+        </w:tc>
+        <w:tc>
+          <w:tcPr>
+            <w:tcW w:type="dxa" w:w="2160"/>
+          </w:tcPr>
+          <w:p>
+            <w:r>
+              <w:t>561</w:t>
+            </w:r>
+          </w:p>
+        </w:tc>
+        <w:tc>
+          <w:tcPr>
+            <w:tcW w:type="dxa" w:w="2160"/>
+          </w:tcPr>
+          <w:p>
+            <w:r>
+              <w:t>561</w:t>
+            </w:r>
+          </w:p>
+        </w:tc>
+        <w:tc>
+          <w:tcPr>
+            <w:tcW w:type="dxa" w:w="2160"/>
+          </w:tcPr>
+          <w:p>
+            <w:r>
+              <w:t>0 (identique)</w:t>
+            </w:r>
+          </w:p>
+        </w:tc>
+      </w:tr>
+      <w:tr>
+        <w:tc>
+          <w:tcPr>
+            <w:tcW w:type="dxa" w:w="2160"/>
+          </w:tcPr>
+          <w:p>
+            <w:r>
+              <w:t>4. **qty_good livré**</w:t>
+            </w:r>
+          </w:p>
+        </w:tc>
+        <w:tc>
+          <w:tcPr>
+            <w:tcW w:type="dxa" w:w="2160"/>
+          </w:tcPr>
+          <w:p>
+            <w:r>
+              <w:t>**533** (95 %)</w:t>
+            </w:r>
+          </w:p>
+        </w:tc>
+        <w:tc>
+          <w:tcPr>
+            <w:tcW w:type="dxa" w:w="2160"/>
+          </w:tcPr>
+          <w:p>
+            <w:r>
+              <w:t>**390** (69.5 %)</w:t>
+            </w:r>
+          </w:p>
+        </w:tc>
+        <w:tc>
+          <w:tcPr>
+            <w:tcW w:type="dxa" w:w="2160"/>
+          </w:tcPr>
+          <w:p>
+            <w:r>
+              <w:t>**−143 (−25 pp)**</w:t>
+            </w:r>
+          </w:p>
+        </w:tc>
+      </w:tr>
+    </w:tbl>
+    <w:p>
+      <w:r>
+        <w:t>Les hypothèses §28.12.3 (V12.7.a/b/c/d) sont toutes invalidées : la</w:t>
+      </w:r>
+    </w:p>
+    <w:p>
+      <w:r>
+        <w:t>quantité demandée (561), la quantité candidate (1683 = BOM × 3),</w:t>
+      </w:r>
+    </w:p>
+    <w:p>
+      <w:r>
+        <w:t>et la quantité OF lancée (561) sont identiques entre OF et FLUX.</w:t>
+      </w:r>
+    </w:p>
+    <w:p>
+      <w:r>
+        <w:t>**Le défaut Q vient exclusivement de la phase d'exécution des</w:t>
+      </w:r>
+    </w:p>
+    <w:p>
+      <w:r>
+        <w:t>OFs**, pas de la génération du plan.</w:t>
+      </w:r>
+    </w:p>
+    <w:p>
+      <w:pPr>
+        <w:pStyle w:val="Heading4"/>
+      </w:pPr>
+      <w:r>
+        <w:t>§28.13.1 Vraie cause identifiée — OFs stuck `in_progress`</w:t>
+      </w:r>
+    </w:p>
+    <w:p>
+      <w:r>
+        <w:t>L'inspection détaillée a révélé :</w:t>
+      </w:r>
+    </w:p>
+    <w:p>
+      <w:pPr>
+        <w:pStyle w:val="ListBullet"/>
+      </w:pPr>
+      <w:r>
+        <w:t>**OF-0007 (ART-A, qty=60)** : FLUX → `status=in_progress`,</w:t>
+      </w:r>
+    </w:p>
+    <w:p>
+      <w:r>
+        <w:t xml:space="preserve">  qty_good=0 ; ops 1+2 closes (qty_good=57), ops 3+4 (WS-5, WS-6)</w:t>
+      </w:r>
+    </w:p>
+    <w:p>
+      <w:r>
+        <w:t xml:space="preserve">  restées pending</w:t>
+      </w:r>
+    </w:p>
+    <w:p>
+      <w:pPr>
+        <w:pStyle w:val="ListBullet"/>
+      </w:pPr>
+      <w:r>
+        <w:t>**OF-0016 (ART-B, qty=90)** : FLUX → `status=in_progress`,</w:t>
+      </w:r>
+    </w:p>
+    <w:p>
+      <w:r>
+        <w:t xml:space="preserve">  qty_good=0 ; op 1 close, ops 2+3+4 (WS-6, WS-5, WS-6) pending</w:t>
+      </w:r>
+    </w:p>
+    <w:p>
+      <w:r>
+        <w:t>Cause : le smoothing V1.4 étale les offsets uniformément sur</w:t>
+      </w:r>
+    </w:p>
+    <w:p>
+      <w:r>
+        <w:t>l'horizon [horizon_start, horizon_end], sans tenir compte de la</w:t>
+      </w:r>
+    </w:p>
+    <w:p>
+      <w:r>
+        <w:t>durée résiduelle dont l'OF a besoin pour clore toutes ses</w:t>
+      </w:r>
+    </w:p>
+    <w:p>
+      <w:r>
+        <w:t>operations dans le temps restant. Un OF lancé à offset = 16457 min</w:t>
+      </w:r>
+    </w:p>
+    <w:p>
+      <w:r>
+        <w:t>(11 jours après horizon_start dans un horizon de 20 jours) doit</w:t>
+      </w:r>
+    </w:p>
+    <w:p>
+      <w:r>
+        <w:t>clore 4 operations en 9 jours ; avec queueing sur WS-5/WS-6, ce</w:t>
+      </w:r>
+    </w:p>
+    <w:p>
+      <w:r>
+        <w:t>n'est pas suffisant et l'OF reste in_progress.</w:t>
+      </w:r>
+    </w:p>
+    <w:p>
+      <w:r>
+        <w:t>OF, lui, lance toutes les OFs au démarrage de l'horizon</w:t>
+      </w:r>
+    </w:p>
+    <w:p>
+      <w:r>
+        <w:t>(planned_start = horizon_start) et a 20 jours pleins pour les</w:t>
+      </w:r>
+    </w:p>
+    <w:p>
+      <w:r>
+        <w:t>clore — d'où qty_good = 95 %.</w:t>
+      </w:r>
+    </w:p>
+    <w:p>
+      <w:pPr>
+        <w:pStyle w:val="Heading4"/>
+      </w:pPr>
+      <w:r>
+        <w:t>§28.13.2 V12.7 — Implémentation horizon-aware</w:t>
+      </w:r>
+    </w:p>
+    <w:p>
+      <w:r>
+        <w:t>Implémenté dans flux/smoothing.py :</w:t>
+      </w:r>
+    </w:p>
+    <w:p>
+      <w:pPr/>
+      <w:r>
+        <w:rPr>
+          <w:rFonts w:ascii="Consolas" w:hAnsi="Consolas"/>
+          <w:sz w:val="20"/>
+        </w:rPr>
+        <w:t># Borne supplémentaire (V12.7)</w:t>
+      </w:r>
+    </w:p>
+    <w:p>
+      <w:pPr/>
+      <w:r>
+        <w:rPr>
+          <w:rFonts w:ascii="Consolas" w:hAnsi="Consolas"/>
+          <w:sz w:val="20"/>
+        </w:rPr>
+        <w:t>if smoothing_horizon_aware:</w:t>
+      </w:r>
+    </w:p>
+    <w:p>
+      <w:pPr/>
+      <w:r>
+        <w:rPr>
+          <w:rFonts w:ascii="Consolas" w:hAnsi="Consolas"/>
+          <w:sz w:val="20"/>
+        </w:rPr>
+        <w:t xml:space="preserve">    latest_start_horizon = horizon_total_min - duration × safety_factor</w:t>
+      </w:r>
+    </w:p>
+    <w:p>
+      <w:pPr/>
+      <w:r>
+        <w:rPr>
+          <w:rFonts w:ascii="Consolas" w:hAnsi="Consolas"/>
+          <w:sz w:val="20"/>
+        </w:rPr>
+        <w:t xml:space="preserve">    offset_min = min(offset_min, latest_start_horizon)</w:t>
+      </w:r>
+    </w:p>
+    <w:p>
+      <w:r>
+        <w:t>Deux paramètres :</w:t>
+      </w:r>
+    </w:p>
+    <w:p>
+      <w:pPr>
+        <w:pStyle w:val="ListBullet"/>
+      </w:pPr>
+      <w:r>
+        <w:t>`smoothing_horizon_aware` (default 0) : flag d'activation</w:t>
+      </w:r>
+    </w:p>
+    <w:p>
+      <w:pPr>
+        <w:pStyle w:val="ListBullet"/>
+      </w:pPr>
+      <w:r>
+        <w:t>`smoothing_horizon_safety_factor` (default 10) : multiplicateur</w:t>
+      </w:r>
+    </w:p>
+    <w:p>
+      <w:r>
+        <w:t xml:space="preserve">  appliqué à Σ(unit_time × quantity) pour absorber le queueing</w:t>
+      </w:r>
+    </w:p>
+    <w:p>
+      <w:r>
+        <w:t xml:space="preserve">  inter-WS (la durée processing-only sous-estime le temps elapsed</w:t>
+      </w:r>
+    </w:p>
+    <w:p>
+      <w:r>
+        <w:t xml:space="preserve">  réel d'un facteur ~100-150× quand utilisation &gt; 0.7)</w:t>
+      </w:r>
+    </w:p>
+    <w:p>
+      <w:pPr>
+        <w:pStyle w:val="Heading4"/>
+      </w:pPr>
+      <w:r>
+        <w:t>§28.13.3 Étude comparative V11 vs V12.7 (160 runs)</w:t>
+      </w:r>
+    </w:p>
+    <w:p>
+      <w:r>
+        <w:t>Étude docs/build_v12_7_comparative.py — 4 scénarios stress XL,</w:t>
+      </w:r>
+    </w:p>
+    <w:p>
+      <w:r>
+        <w:t>10 seeds (3000-3009), 2 doctrines (FLUX, EVENT), 2 régimes,</w:t>
+      </w:r>
+    </w:p>
+    <w:p>
+      <w:r>
+        <w:t>safety_factor = 150 (validé empiriquement sur baseline_xl).</w:t>
+      </w:r>
+    </w:p>
+    <w:tbl>
+      <w:tblPr>
+        <w:tblStyle w:val="LightGrid-Accent1"/>
+        <w:tblW w:type="auto" w:w="0"/>
+        <w:tblLook w:firstColumn="1" w:firstRow="1" w:lastColumn="0" w:lastRow="0" w:noHBand="0" w:noVBand="1" w:val="04A0"/>
+      </w:tblPr>
+      <w:tblGrid>
+        <w:gridCol w:w="2160"/>
+        <w:gridCol w:w="2160"/>
+        <w:gridCol w:w="2160"/>
+        <w:gridCol w:w="2160"/>
+      </w:tblGrid>
+      <w:tr>
+        <w:tc>
+          <w:tcPr>
+            <w:tcW w:type="dxa" w:w="2160"/>
+          </w:tcPr>
+          <w:p>
+            <w:r>
+              <w:rPr>
+                <w:b/>
+              </w:rPr>
+              <w:t>Scénario</w:t>
+            </w:r>
+          </w:p>
+        </w:tc>
+        <w:tc>
+          <w:tcPr>
+            <w:tcW w:type="dxa" w:w="2160"/>
+          </w:tcPr>
+          <w:p>
+            <w:r>
+              <w:rPr>
+                <w:b/>
+              </w:rPr>
+              <w:t>Doctrine</w:t>
+            </w:r>
+          </w:p>
+        </w:tc>
+        <w:tc>
+          <w:tcPr>
+            <w:tcW w:type="dxa" w:w="2160"/>
+          </w:tcPr>
+          <w:p>
+            <w:r>
+              <w:rPr>
+                <w:b/>
+              </w:rPr>
+              <w:t>Δ OTIF (pp)</w:t>
+            </w:r>
+          </w:p>
+        </w:tc>
+        <w:tc>
+          <w:tcPr>
+            <w:tcW w:type="dxa" w:w="2160"/>
+          </w:tcPr>
+          <w:p>
+            <w:r>
+              <w:rPr>
+                <w:b/>
+              </w:rPr>
+              <w:t>Δ Coût (%)</w:t>
+            </w:r>
+          </w:p>
+        </w:tc>
+      </w:tr>
+      <w:tr>
+        <w:tc>
+          <w:tcPr>
+            <w:tcW w:type="dxa" w:w="2160"/>
+          </w:tcPr>
+          <w:p>
+            <w:r>
+              <w:t>baseline_xl</w:t>
+            </w:r>
+          </w:p>
+        </w:tc>
+        <w:tc>
+          <w:tcPr>
+            <w:tcW w:type="dxa" w:w="2160"/>
+          </w:tcPr>
+          <w:p>
+            <w:r>
+              <w:t>FLUX</w:t>
+            </w:r>
+          </w:p>
+        </w:tc>
+        <w:tc>
+          <w:tcPr>
+            <w:tcW w:type="dxa" w:w="2160"/>
+          </w:tcPr>
+          <w:p>
+            <w:r>
+              <w:t>**+25.6 pp**</w:t>
+            </w:r>
+          </w:p>
+        </w:tc>
+        <w:tc>
+          <w:tcPr>
+            <w:tcW w:type="dxa" w:w="2160"/>
+          </w:tcPr>
+          <w:p>
+            <w:r>
+              <w:t>+29.5 %</w:t>
+            </w:r>
+          </w:p>
+        </w:tc>
+      </w:tr>
+      <w:tr>
+        <w:tc>
+          <w:tcPr>
+            <w:tcW w:type="dxa" w:w="2160"/>
+          </w:tcPr>
+          <w:p>
+            <w:r>
+              <w:t>baseline_xl</w:t>
+            </w:r>
+          </w:p>
+        </w:tc>
+        <w:tc>
+          <w:tcPr>
+            <w:tcW w:type="dxa" w:w="2160"/>
+          </w:tcPr>
+          <w:p>
+            <w:r>
+              <w:t>EVENT</w:t>
+            </w:r>
+          </w:p>
+        </w:tc>
+        <w:tc>
+          <w:tcPr>
+            <w:tcW w:type="dxa" w:w="2160"/>
+          </w:tcPr>
+          <w:p>
+            <w:r>
+              <w:t>**+25.6 pp**</w:t>
+            </w:r>
+          </w:p>
+        </w:tc>
+        <w:tc>
+          <w:tcPr>
+            <w:tcW w:type="dxa" w:w="2160"/>
+          </w:tcPr>
+          <w:p>
+            <w:r>
+              <w:t>+18.7 %</w:t>
+            </w:r>
+          </w:p>
+        </w:tc>
+      </w:tr>
+      <w:tr>
+        <w:tc>
+          <w:tcPr>
+            <w:tcW w:type="dxa" w:w="2160"/>
+          </w:tcPr>
+          <w:p>
+            <w:r>
+              <w:t>stress_double_breakdown_xl</w:t>
+            </w:r>
+          </w:p>
+        </w:tc>
+        <w:tc>
+          <w:tcPr>
+            <w:tcW w:type="dxa" w:w="2160"/>
+          </w:tcPr>
+          <w:p>
+            <w:r>
+              <w:t>FLUX</w:t>
+            </w:r>
+          </w:p>
+        </w:tc>
+        <w:tc>
+          <w:tcPr>
+            <w:tcW w:type="dxa" w:w="2160"/>
+          </w:tcPr>
+          <w:p>
+            <w:r>
+              <w:t>**+27.5 pp**</w:t>
+            </w:r>
+          </w:p>
+        </w:tc>
+        <w:tc>
+          <w:tcPr>
+            <w:tcW w:type="dxa" w:w="2160"/>
+          </w:tcPr>
+          <w:p>
+            <w:r>
+              <w:t>+66.9 %</w:t>
+            </w:r>
+          </w:p>
+        </w:tc>
+      </w:tr>
+      <w:tr>
+        <w:tc>
+          <w:tcPr>
+            <w:tcW w:type="dxa" w:w="2160"/>
+          </w:tcPr>
+          <w:p>
+            <w:r>
+              <w:t>stress_double_breakdown_xl</w:t>
+            </w:r>
+          </w:p>
+        </w:tc>
+        <w:tc>
+          <w:tcPr>
+            <w:tcW w:type="dxa" w:w="2160"/>
+          </w:tcPr>
+          <w:p>
+            <w:r>
+              <w:t>EVENT</w:t>
+            </w:r>
+          </w:p>
+        </w:tc>
+        <w:tc>
+          <w:tcPr>
+            <w:tcW w:type="dxa" w:w="2160"/>
+          </w:tcPr>
+          <w:p>
+            <w:r>
+              <w:t>**+27.5 pp**</w:t>
+            </w:r>
+          </w:p>
+        </w:tc>
+        <w:tc>
+          <w:tcPr>
+            <w:tcW w:type="dxa" w:w="2160"/>
+          </w:tcPr>
+          <w:p>
+            <w:r>
+              <w:t>+29.5 %</w:t>
+            </w:r>
+          </w:p>
+        </w:tc>
+      </w:tr>
+      <w:tr>
+        <w:tc>
+          <w:tcPr>
+            <w:tcW w:type="dxa" w:w="2160"/>
+          </w:tcPr>
+          <w:p>
+            <w:r>
+              <w:t>stress_cascade_nc_xl</w:t>
+            </w:r>
+          </w:p>
+        </w:tc>
+        <w:tc>
+          <w:tcPr>
+            <w:tcW w:type="dxa" w:w="2160"/>
+          </w:tcPr>
+          <w:p>
+            <w:r>
+              <w:t>FLUX</w:t>
+            </w:r>
+          </w:p>
+        </w:tc>
+        <w:tc>
+          <w:tcPr>
+            <w:tcW w:type="dxa" w:w="2160"/>
+          </w:tcPr>
+          <w:p>
+            <w:r>
+              <w:t>**+27.5 pp**</w:t>
+            </w:r>
+          </w:p>
+        </w:tc>
+        <w:tc>
+          <w:tcPr>
+            <w:tcW w:type="dxa" w:w="2160"/>
+          </w:tcPr>
+          <w:p>
+            <w:r>
+              <w:t>+21.9 %</w:t>
+            </w:r>
+          </w:p>
+        </w:tc>
+      </w:tr>
+      <w:tr>
+        <w:tc>
+          <w:tcPr>
+            <w:tcW w:type="dxa" w:w="2160"/>
+          </w:tcPr>
+          <w:p>
+            <w:r>
+              <w:t>stress_cascade_nc_xl</w:t>
+            </w:r>
+          </w:p>
+        </w:tc>
+        <w:tc>
+          <w:tcPr>
+            <w:tcW w:type="dxa" w:w="2160"/>
+          </w:tcPr>
+          <w:p>
+            <w:r>
+              <w:t>EVENT</w:t>
+            </w:r>
+          </w:p>
+        </w:tc>
+        <w:tc>
+          <w:tcPr>
+            <w:tcW w:type="dxa" w:w="2160"/>
+          </w:tcPr>
+          <w:p>
+            <w:r>
+              <w:t>**+27.5 pp**</w:t>
+            </w:r>
+          </w:p>
+        </w:tc>
+        <w:tc>
+          <w:tcPr>
+            <w:tcW w:type="dxa" w:w="2160"/>
+          </w:tcPr>
+          <w:p>
+            <w:r>
+              <w:t>+22.0 %</w:t>
+            </w:r>
+          </w:p>
+        </w:tc>
+      </w:tr>
+      <w:tr>
+        <w:tc>
+          <w:tcPr>
+            <w:tcW w:type="dxa" w:w="2160"/>
+          </w:tcPr>
+          <w:p>
+            <w:r>
+              <w:t>stress_demand_spike_xl</w:t>
+            </w:r>
+          </w:p>
+        </w:tc>
+        <w:tc>
+          <w:tcPr>
+            <w:tcW w:type="dxa" w:w="2160"/>
+          </w:tcPr>
+          <w:p>
+            <w:r>
+              <w:t>FLUX</w:t>
+            </w:r>
+          </w:p>
+        </w:tc>
+        <w:tc>
+          <w:tcPr>
+            <w:tcW w:type="dxa" w:w="2160"/>
+          </w:tcPr>
+          <w:p>
+            <w:r>
+              <w:t>**+16.8 pp**</w:t>
+            </w:r>
+          </w:p>
+        </w:tc>
+        <w:tc>
+          <w:tcPr>
+            <w:tcW w:type="dxa" w:w="2160"/>
+          </w:tcPr>
+          <w:p>
+            <w:r>
+              <w:t>+20.4 %</w:t>
+            </w:r>
+          </w:p>
+        </w:tc>
+      </w:tr>
+      <w:tr>
+        <w:tc>
+          <w:tcPr>
+            <w:tcW w:type="dxa" w:w="2160"/>
+          </w:tcPr>
+          <w:p>
+            <w:r>
+              <w:t>stress_demand_spike_xl</w:t>
+            </w:r>
+          </w:p>
+        </w:tc>
+        <w:tc>
+          <w:tcPr>
+            <w:tcW w:type="dxa" w:w="2160"/>
+          </w:tcPr>
+          <w:p>
+            <w:r>
+              <w:t>EVENT</w:t>
+            </w:r>
+          </w:p>
+        </w:tc>
+        <w:tc>
+          <w:tcPr>
+            <w:tcW w:type="dxa" w:w="2160"/>
+          </w:tcPr>
+          <w:p>
+            <w:r>
+              <w:t>**+16.8 pp**</w:t>
+            </w:r>
+          </w:p>
+        </w:tc>
+        <w:tc>
+          <w:tcPr>
+            <w:tcW w:type="dxa" w:w="2160"/>
+          </w:tcPr>
+          <w:p>
+            <w:r>
+              <w:t>+20.4 %</w:t>
+            </w:r>
+          </w:p>
+        </w:tc>
+      </w:tr>
+    </w:tbl>
+    <w:p>
+      <w:r>
+        <w:t>OTIF moyen FLUX (4 scénarios) : 0.658 → 0.909 (+25.1 pp).</w:t>
+      </w:r>
+    </w:p>
+    <w:p>
+      <w:r>
+        <w:t>3 scénarios sur 4 atteignent 0.950 (parité avec OF).</w:t>
+      </w:r>
+    </w:p>
+    <w:p>
+      <w:r>
+        <w:t>1 scénario (stress_demand_spike) plafonne à 0.784 — la demande</w:t>
+      </w:r>
+    </w:p>
+    <w:p>
+      <w:r>
+        <w:t>excède la capacité brute, OTIF ≤ Q_max indépendamment du smoothing.</w:t>
+      </w:r>
+    </w:p>
+    <w:p>
+      <w:r>
+        <w:t>Coût moyen FLUX : +34.7 % (médiane +25.7 %) — surcoût lié à</w:t>
+      </w:r>
+    </w:p>
+    <w:p>
+      <w:r>
+        <w:t>l'inventaire/WIP plus long en l'absence d'étalement.</w:t>
+      </w:r>
+    </w:p>
+    <w:p>
+      <w:pPr>
+        <w:pStyle w:val="Heading4"/>
+      </w:pPr>
+      <w:r>
+        <w:t>§28.13.4 Bilan V12.7</w:t>
+      </w:r>
+    </w:p>
+    <w:p>
+      <w:r>
+        <w:t>V12.7 corrige le défaut Q identifié par mesure :</w:t>
+      </w:r>
+    </w:p>
+    <w:p>
+      <w:pPr>
+        <w:pStyle w:val="ListBullet"/>
+      </w:pPr>
+      <w:r>
+        <w:t>Le smoothing V1.4 borne désormais ses offsets pour garantir la</w:t>
+      </w:r>
+    </w:p>
+    <w:p>
+      <w:r>
+        <w:t xml:space="preserve">  closure des OFs avant horizon_end.</w:t>
+      </w:r>
+    </w:p>
+    <w:p>
+      <w:pPr>
+        <w:pStyle w:val="ListBullet"/>
+      </w:pPr>
+      <w:r>
+        <w:t>Le paramètre `smoothing_horizon_safety_factor` permet à</w:t>
+      </w:r>
+    </w:p>
+    <w:p>
+      <w:r>
+        <w:t xml:space="preserve">  l'utilisateur d'ajuster le compromis OTIF/cost selon le taux</w:t>
+      </w:r>
+    </w:p>
+    <w:p>
+      <w:r>
+        <w:t xml:space="preserve">  d'utilisation des workstations (Little's law).</w:t>
+      </w:r>
+    </w:p>
+    <w:p>
+      <w:pPr>
+        <w:pStyle w:val="ListBullet"/>
+      </w:pPr>
+      <w:r>
+        <w:t>La doctrine FLUX/EVENT, activée V12.7, **rattrape OF sur</w:t>
+      </w:r>
+    </w:p>
+    <w:p>
+      <w:r>
+        <w:t xml:space="preserve">  l'OTIF** (0.95) en restant moins coûteuse en moyenne (lissage</w:t>
+      </w:r>
+    </w:p>
+    <w:p>
+      <w:r>
+        <w:t xml:space="preserve">  partiel préservé jusqu'au cap horizon).</w:t>
+      </w:r>
+    </w:p>
+    <w:p>
+      <w:r>
+        <w:t>Trade-off doctrinal explicite : V12.7 sacrifie 20-30 % du gain</w:t>
+      </w:r>
+    </w:p>
+    <w:p>
+      <w:r>
+        <w:t>de coût FLUX (vs OF non-smoothing) pour récupérer 25 pp d'OTIF.</w:t>
+      </w:r>
+    </w:p>
+    <w:p>
+      <w:r>
+        <w:t>L'arbitrage QCDS § 30 reste pertinent : la doctrine choisie</w:t>
+      </w:r>
+    </w:p>
+    <w:p>
+      <w:r>
+        <w:t>dépend de la priorité métier (OTIF-first → V12.7 obligatoire,</w:t>
+      </w:r>
+    </w:p>
+    <w:p>
+      <w:r>
+        <w:t>Cost-first → V11 acceptable si OTIF cible &lt; 0.70).</w:t>
+      </w:r>
+    </w:p>
+    <w:p>
+      <w:r>
+        <w:t>V12.7 est livré et mesuré. Le défaut Q est résolu.</w:t>
+      </w:r>
+    </w:p>
+    <w:p>
+      <w:r>
+        <w:t>Chart : docs/charts/v12_7_otif_comparative.png.</w:t>
+      </w:r>
+    </w:p>
+    <w:p>
+      <w:r>
+        <w:t>Données détaillées : docs/cadrage_v4_v12_7_data.md.</w:t>
       </w:r>
     </w:p>
     <w:p>

</xml_diff>